<commit_message>
Corrigiendo y optimizando I_1796473-Opc-D2v2_optimizado.Rmd
</commit_message>
<xml_diff>
--- a/Lab-Manjaro/15-S1-2025-SEDQ/salida/juegos_deportivos_aleatorio_interpretacion_representacion_n2_opcA_v1_1.docx
+++ b/Lab-Manjaro/15-S1-2025-SEDQ/salida/juegos_deportivos_aleatorio_interpretacion_representacion_n2_opcA_v1_1.docx
@@ -7,7 +7,49 @@
         <w:pStyle w:val="Title"/>
       </w:pPr>
       <w:r>
-        <w:t xml:space="preserve">I. E. Pedacito de Cielo, La Tebaida, Quindío</w:t>
+        <w:t xml:space="preserve">I.</w:t>
+      </w:r>
+      <w:r>
+        <w:t xml:space="preserve"> </w:t>
+      </w:r>
+      <w:r>
+        <w:t xml:space="preserve">E.</w:t>
+      </w:r>
+      <w:r>
+        <w:t xml:space="preserve"> </w:t>
+      </w:r>
+      <w:r>
+        <w:t xml:space="preserve">Pedacito</w:t>
+      </w:r>
+      <w:r>
+        <w:t xml:space="preserve"> </w:t>
+      </w:r>
+      <w:r>
+        <w:t xml:space="preserve">de</w:t>
+      </w:r>
+      <w:r>
+        <w:t xml:space="preserve"> </w:t>
+      </w:r>
+      <w:r>
+        <w:t xml:space="preserve">Cielo,</w:t>
+      </w:r>
+      <w:r>
+        <w:t xml:space="preserve"> </w:t>
+      </w:r>
+      <w:r>
+        <w:t xml:space="preserve">La</w:t>
+      </w:r>
+      <w:r>
+        <w:t xml:space="preserve"> </w:t>
+      </w:r>
+      <w:r>
+        <w:t xml:space="preserve">Tebaida,</w:t>
+      </w:r>
+      <w:r>
+        <w:t xml:space="preserve"> </w:t>
+      </w:r>
+      <w:r>
+        <w:t xml:space="preserve">Quindío</w:t>
       </w:r>
     </w:p>
     <w:p>
@@ -15,7 +57,25 @@
         <w:pStyle w:val="Author"/>
       </w:pPr>
       <w:r>
-        <w:t xml:space="preserve">Simulacro Matemáticas Saber ICFES</w:t>
+        <w:t xml:space="preserve">Simulacro</w:t>
+      </w:r>
+      <w:r>
+        <w:t xml:space="preserve"> </w:t>
+      </w:r>
+      <w:r>
+        <w:t xml:space="preserve">Matemáticas</w:t>
+      </w:r>
+      <w:r>
+        <w:t xml:space="preserve"> </w:t>
+      </w:r>
+      <w:r>
+        <w:t xml:space="preserve">Saber</w:t>
+      </w:r>
+      <w:r>
+        <w:t xml:space="preserve"> </w:t>
+      </w:r>
+      <w:r>
+        <w:t xml:space="preserve">ICFES</w:t>
       </w:r>
     </w:p>
     <w:p>
@@ -23,7 +83,31 @@
         <w:pStyle w:val="Date"/>
       </w:pPr>
       <w:r>
-        <w:t xml:space="preserve">Probabilidad y Estadística - Porcentajes</w:t>
+        <w:t xml:space="preserve">Probabilidad</w:t>
+      </w:r>
+      <w:r>
+        <w:t xml:space="preserve"> </w:t>
+      </w:r>
+      <w:r>
+        <w:t xml:space="preserve">y</w:t>
+      </w:r>
+      <w:r>
+        <w:t xml:space="preserve"> </w:t>
+      </w:r>
+      <w:r>
+        <w:t xml:space="preserve">Estadística</w:t>
+      </w:r>
+      <w:r>
+        <w:t xml:space="preserve"> </w:t>
+      </w:r>
+      <w:r>
+        <w:t xml:space="preserve">-</w:t>
+      </w:r>
+      <w:r>
+        <w:t xml:space="preserve"> </w:t>
+      </w:r>
+      <w:r>
+        <w:t xml:space="preserve">Porcentajes</w:t>
       </w:r>
     </w:p>
     <w:bookmarkStart w:id="55" w:name="section"/>
@@ -53,7 +137,7 @@
         <w:br/>
       </w:r>
       <w:r>
-        <w:t xml:space="preserve">los Juegos Centroamericanos se realizan cada cuatro años con la participación de países de Centroamérica, alternando las sedes deportivas. La tabla muestra algunos datos de las últimas cinco versiones de los Juegos Centroamericanos:</w:t>
+        <w:t xml:space="preserve">los Juegos Asiáticos se realizan cada cuatro años con la participación de países de Asia, alternando las sedes deportivas. La tabla muestra algunos datos de las últimas cinco versiones de los Juegos Asiáticos:</w:t>
       </w:r>
     </w:p>
     <w:p>
@@ -66,7 +150,7 @@
       <w:r>
         <w:drawing>
           <wp:inline>
-            <wp:extent cx="4267200" cy="2540205"/>
+            <wp:extent cx="4267200" cy="2537331"/>
             <wp:effectExtent b="0" l="0" r="0" t="0"/>
             <wp:docPr descr="image" title="" id="21" name="Picture"/>
             <a:graphic>
@@ -80,6 +164,692 @@
                   </pic:nvPicPr>
                   <pic:blipFill>
                     <a:blip r:embed="rId20"/>
+                    <a:stretch>
+                      <a:fillRect/>
+                    </a:stretch>
+                  </pic:blipFill>
+                  <pic:spPr bwMode="auto">
+                    <a:xfrm>
+                      <a:off x="0" y="0"/>
+                      <a:ext cx="4267200" cy="2537331"/>
+                    </a:xfrm>
+                    <a:prstGeom prst="rect">
+                      <a:avLst/>
+                    </a:prstGeom>
+                    <a:noFill/>
+                    <a:ln w="9525">
+                      <a:noFill/>
+                      <a:headEnd/>
+                      <a:tailEnd/>
+                    </a:ln>
+                  </pic:spPr>
+                </pic:pic>
+              </a:graphicData>
+            </a:graphic>
+          </wp:inline>
+        </w:drawing>
+      </w:r>
+    </w:p>
+    <w:p>
+      <w:pPr>
+        <w:numPr>
+          <w:ilvl w:val="0"/>
+          <w:numId w:val="1000"/>
+        </w:numPr>
+      </w:pPr>
+      <w:r>
+        <w:t xml:space="preserve">Del total de atletas participantes en 2022, el 6% compite en ciclismo. Para determinar el número de atletas de ciclismo ese año, se sugiere multiplicar 0.6 por el número de atletas que participaron en 2022. El procedimiento sugerido es:</w:t>
+      </w:r>
+    </w:p>
+    <w:p>
+      <w:pPr>
+        <w:numPr>
+          <w:ilvl w:val="1"/>
+          <w:numId w:val="1002"/>
+        </w:numPr>
+      </w:pPr>
+      <w:r>
+        <w:t xml:space="preserve">insuficiente, porque falta considerar el número total de deportes en el evento</w:t>
+      </w:r>
+    </w:p>
+    <w:p>
+      <w:pPr>
+        <w:numPr>
+          <w:ilvl w:val="1"/>
+          <w:numId w:val="1002"/>
+        </w:numPr>
+      </w:pPr>
+      <w:r>
+        <w:t xml:space="preserve">incorrecto, porque se debe multiplicar 0.06 por el número de atletas participantes</w:t>
+      </w:r>
+    </w:p>
+    <w:p>
+      <w:pPr>
+        <w:numPr>
+          <w:ilvl w:val="1"/>
+          <w:numId w:val="1002"/>
+        </w:numPr>
+      </w:pPr>
+      <w:r>
+        <w:t xml:space="preserve">insuficiente, porque falta multiplicar el resultado por el número de países participantes en 2022</w:t>
+      </w:r>
+    </w:p>
+    <w:p>
+      <w:pPr>
+        <w:numPr>
+          <w:ilvl w:val="1"/>
+          <w:numId w:val="1002"/>
+        </w:numPr>
+      </w:pPr>
+      <w:r>
+        <w:t xml:space="preserve">correcto, solamente si el resultado obtenido es un número exacto de atletas en ciclismo</w:t>
+      </w:r>
+    </w:p>
+    <w:p>
+      <w:pPr>
+        <w:numPr>
+          <w:ilvl w:val="0"/>
+          <w:numId w:val="1000"/>
+        </w:numPr>
+      </w:pPr>
+      <w:r>
+        <w:rPr>
+          <w:b/>
+          <w:bCs/>
+        </w:rPr>
+        <w:t xml:space="preserve">Solución</w:t>
+      </w:r>
+      <w:r>
+        <w:br/>
+      </w:r>
+      <w:r>
+        <w:t xml:space="preserve">Para resolver este problema, necesitamos evaluar si el procedimiento propuesto para calcular el número de atletas que compiten en ciclismo es matemáticamente correcto.</w:t>
+      </w:r>
+    </w:p>
+    <w:p>
+      <w:pPr>
+        <w:pStyle w:val="Heading3"/>
+        <w:numPr>
+          <w:ilvl w:val="0"/>
+          <w:numId w:val="1000"/>
+        </w:numPr>
+      </w:pPr>
+      <w:bookmarkStart w:id="23" w:name="anuxe1lisis-del-procedimiento-propuesto"/>
+      <w:r>
+        <w:t xml:space="preserve">Análisis del procedimiento propuesto</w:t>
+      </w:r>
+      <w:bookmarkEnd w:id="23"/>
+    </w:p>
+    <w:p>
+      <w:pPr>
+        <w:numPr>
+          <w:ilvl w:val="0"/>
+          <w:numId w:val="1000"/>
+        </w:numPr>
+      </w:pPr>
+      <w:r>
+        <w:rPr>
+          <w:b/>
+          <w:bCs/>
+        </w:rPr>
+        <w:t xml:space="preserve">Datos disponibles:</w:t>
+      </w:r>
+    </w:p>
+    <w:p>
+      <w:pPr>
+        <w:numPr>
+          <w:ilvl w:val="1"/>
+          <w:numId w:val="1003"/>
+        </w:numPr>
+      </w:pPr>
+      <w:r>
+        <w:t xml:space="preserve">Total de atletas en 2022: 7.338</w:t>
+      </w:r>
+    </w:p>
+    <w:p>
+      <w:pPr>
+        <w:numPr>
+          <w:ilvl w:val="1"/>
+          <w:numId w:val="1003"/>
+        </w:numPr>
+      </w:pPr>
+      <w:r>
+        <w:t xml:space="preserve">Porcentaje que compite en ciclismo: 6%</w:t>
+      </w:r>
+    </w:p>
+    <w:p>
+      <w:pPr>
+        <w:numPr>
+          <w:ilvl w:val="1"/>
+          <w:numId w:val="1003"/>
+        </w:numPr>
+      </w:pPr>
+      <w:r>
+        <w:t xml:space="preserve">Procedimiento sugerido: multiplicar 0.6 por 7.338</w:t>
+      </w:r>
+    </w:p>
+    <w:p>
+      <w:pPr>
+        <w:pStyle w:val="Heading3"/>
+        <w:numPr>
+          <w:ilvl w:val="0"/>
+          <w:numId w:val="1000"/>
+        </w:numPr>
+      </w:pPr>
+      <w:bookmarkStart w:id="24" w:name="X27d6c5c273dc4a3785c7f87f825fb56e431524d"/>
+      <w:r>
+        <w:t xml:space="preserve">Identificación del error en el procedimiento</w:t>
+      </w:r>
+      <w:bookmarkEnd w:id="24"/>
+    </w:p>
+    <w:p>
+      <w:pPr>
+        <w:numPr>
+          <w:ilvl w:val="0"/>
+          <w:numId w:val="1000"/>
+        </w:numPr>
+      </w:pPr>
+      <w:r>
+        <w:rPr>
+          <w:b/>
+          <w:bCs/>
+        </w:rPr>
+        <w:t xml:space="preserve">Error en el procedimiento sugerido:</w:t>
+      </w:r>
+    </w:p>
+    <w:p>
+      <w:pPr>
+        <w:numPr>
+          <w:ilvl w:val="0"/>
+          <w:numId w:val="1000"/>
+        </w:numPr>
+      </w:pPr>
+      <w:r>
+        <w:t xml:space="preserve">El procedimiento propone multiplicar 0.6 por el total de atletas, pero esto es</w:t>
+      </w:r>
+      <w:r>
+        <w:t xml:space="preserve"> </w:t>
+      </w:r>
+      <w:r>
+        <w:rPr>
+          <w:b/>
+          <w:bCs/>
+        </w:rPr>
+        <w:t xml:space="preserve">INCORRECTO</w:t>
+      </w:r>
+      <w:r>
+        <w:t xml:space="preserve">.</w:t>
+      </w:r>
+    </w:p>
+    <w:p>
+      <w:pPr>
+        <w:numPr>
+          <w:ilvl w:val="0"/>
+          <w:numId w:val="1000"/>
+        </w:numPr>
+      </w:pPr>
+      <w:r>
+        <w:rPr>
+          <w:b/>
+          <w:bCs/>
+        </w:rPr>
+        <w:t xml:space="preserve">Procedimiento correcto:</w:t>
+      </w:r>
+    </w:p>
+    <w:p>
+      <w:pPr>
+        <w:numPr>
+          <w:ilvl w:val="0"/>
+          <w:numId w:val="1000"/>
+        </w:numPr>
+      </w:pPr>
+      <w:r>
+        <w:t xml:space="preserve">El cálculo de un porcentaje de una cantidad total se realiza multiplicando el porcentaje (expresado como decimal) por la cantidad total:</w:t>
+      </w:r>
+    </w:p>
+    <w:p>
+      <w:pPr>
+        <w:numPr>
+          <w:ilvl w:val="1"/>
+          <w:numId w:val="1004"/>
+        </w:numPr>
+      </w:pPr>
+      <w:r>
+        <w:t xml:space="preserve">6% = 0.06 (no 0.6)</w:t>
+      </w:r>
+    </w:p>
+    <w:p>
+      <w:pPr>
+        <w:numPr>
+          <w:ilvl w:val="1"/>
+          <w:numId w:val="1004"/>
+        </w:numPr>
+      </w:pPr>
+      <w:r>
+        <w:rPr>
+          <w:b/>
+          <w:bCs/>
+        </w:rPr>
+        <w:t xml:space="preserve">Cálculo correcto:</w:t>
+      </w:r>
+      <w:r>
+        <w:t xml:space="preserve"> </w:t>
+      </w:r>
+      <w:r>
+        <w:t xml:space="preserve">6% de 7.338 = 0.06 × 7.338 = 440</w:t>
+      </w:r>
+    </w:p>
+    <w:p>
+      <w:pPr>
+        <w:numPr>
+          <w:ilvl w:val="0"/>
+          <w:numId w:val="1000"/>
+        </w:numPr>
+      </w:pPr>
+      <w:r>
+        <w:rPr>
+          <w:b/>
+          <w:bCs/>
+        </w:rPr>
+        <w:t xml:space="preserve">Cálculo con el procedimiento incorrecto sugerido:</w:t>
+      </w:r>
+      <w:r>
+        <w:t xml:space="preserve"> </w:t>
+      </w:r>
+      <w:r>
+        <w:t xml:space="preserve">0.6 × 7.338 = 4.403 (esto sería el 60%, no el 6%)</w:t>
+      </w:r>
+    </w:p>
+    <w:p>
+      <w:pPr>
+        <w:pStyle w:val="Heading3"/>
+        <w:numPr>
+          <w:ilvl w:val="0"/>
+          <w:numId w:val="1000"/>
+        </w:numPr>
+      </w:pPr>
+      <w:bookmarkStart w:id="25" w:name="evaluaciuxf3n-de-cada-opciuxf3n"/>
+      <w:r>
+        <w:t xml:space="preserve">Evaluación de cada opción</w:t>
+      </w:r>
+      <w:bookmarkEnd w:id="25"/>
+    </w:p>
+    <w:p>
+      <w:pPr>
+        <w:numPr>
+          <w:ilvl w:val="0"/>
+          <w:numId w:val="1000"/>
+        </w:numPr>
+      </w:pPr>
+      <w:r>
+        <w:rPr>
+          <w:b/>
+          <w:bCs/>
+        </w:rPr>
+        <w:t xml:space="preserve">Análisis de la respuesta correcta:</w:t>
+      </w:r>
+    </w:p>
+    <w:p>
+      <w:pPr>
+        <w:numPr>
+          <w:ilvl w:val="0"/>
+          <w:numId w:val="1000"/>
+        </w:numPr>
+      </w:pPr>
+      <w:r>
+        <w:t xml:space="preserve">La respuesta correcta identifica que el procedimiento es</w:t>
+      </w:r>
+      <w:r>
+        <w:t xml:space="preserve"> </w:t>
+      </w:r>
+      <w:r>
+        <w:rPr>
+          <w:b/>
+          <w:bCs/>
+        </w:rPr>
+        <w:t xml:space="preserve">incorrecto</w:t>
+      </w:r>
+      <w:r>
+        <w:t xml:space="preserve"> </w:t>
+      </w:r>
+      <w:r>
+        <w:t xml:space="preserve">porque:</w:t>
+      </w:r>
+    </w:p>
+    <w:p>
+      <w:pPr>
+        <w:numPr>
+          <w:ilvl w:val="1"/>
+          <w:numId w:val="1005"/>
+        </w:numPr>
+      </w:pPr>
+      <w:r>
+        <w:t xml:space="preserve">El valor 0.6 corresponde al 60%, no al 6%</w:t>
+      </w:r>
+    </w:p>
+    <w:p>
+      <w:pPr>
+        <w:numPr>
+          <w:ilvl w:val="1"/>
+          <w:numId w:val="1005"/>
+        </w:numPr>
+      </w:pPr>
+      <w:r>
+        <w:t xml:space="preserve">Para calcular el 6% se debe usar 0.06, no 0.6</w:t>
+      </w:r>
+    </w:p>
+    <w:p>
+      <w:pPr>
+        <w:numPr>
+          <w:ilvl w:val="1"/>
+          <w:numId w:val="1005"/>
+        </w:numPr>
+      </w:pPr>
+      <w:r>
+        <w:t xml:space="preserve">El error es confundir la representación decimal del porcentaje</w:t>
+      </w:r>
+    </w:p>
+    <w:p>
+      <w:pPr>
+        <w:numPr>
+          <w:ilvl w:val="0"/>
+          <w:numId w:val="1000"/>
+        </w:numPr>
+      </w:pPr>
+      <w:r>
+        <w:rPr>
+          <w:b/>
+          <w:bCs/>
+        </w:rPr>
+        <w:t xml:space="preserve">Análisis de los distractores:</w:t>
+      </w:r>
+    </w:p>
+    <w:p>
+      <w:pPr>
+        <w:numPr>
+          <w:ilvl w:val="1"/>
+          <w:numId w:val="1006"/>
+        </w:numPr>
+      </w:pPr>
+      <w:r>
+        <w:rPr>
+          <w:b/>
+          <w:bCs/>
+        </w:rPr>
+        <w:t xml:space="preserve">Opciones que mencionan</w:t>
+      </w:r>
+      <w:r>
+        <w:rPr>
+          <w:b/>
+          <w:bCs/>
+        </w:rPr>
+        <w:t xml:space="preserve"> </w:t>
+      </w:r>
+      <w:r>
+        <w:rPr>
+          <w:b/>
+          <w:bCs/>
+        </w:rPr>
+        <w:t xml:space="preserve">“</w:t>
+      </w:r>
+      <w:r>
+        <w:rPr>
+          <w:b/>
+          <w:bCs/>
+        </w:rPr>
+        <w:t xml:space="preserve">suficiente</w:t>
+      </w:r>
+      <w:r>
+        <w:rPr>
+          <w:b/>
+          <w:bCs/>
+        </w:rPr>
+        <w:t xml:space="preserve">”</w:t>
+      </w:r>
+      <w:r>
+        <w:t xml:space="preserve">:</w:t>
+      </w:r>
+      <w:r>
+        <w:t xml:space="preserve"> </w:t>
+      </w:r>
+      <w:r>
+        <w:t xml:space="preserve">Son incorrectas porque no identifican el error fundamental en el procedimiento sugerido</w:t>
+      </w:r>
+    </w:p>
+    <w:p>
+      <w:pPr>
+        <w:numPr>
+          <w:ilvl w:val="1"/>
+          <w:numId w:val="1006"/>
+        </w:numPr>
+      </w:pPr>
+      <w:r>
+        <w:rPr>
+          <w:b/>
+          <w:bCs/>
+        </w:rPr>
+        <w:t xml:space="preserve">Opciones que mencionan</w:t>
+      </w:r>
+      <w:r>
+        <w:rPr>
+          <w:b/>
+          <w:bCs/>
+        </w:rPr>
+        <w:t xml:space="preserve"> </w:t>
+      </w:r>
+      <w:r>
+        <w:rPr>
+          <w:b/>
+          <w:bCs/>
+        </w:rPr>
+        <w:t xml:space="preserve">“</w:t>
+      </w:r>
+      <w:r>
+        <w:rPr>
+          <w:b/>
+          <w:bCs/>
+        </w:rPr>
+        <w:t xml:space="preserve">insuficiente</w:t>
+      </w:r>
+      <w:r>
+        <w:rPr>
+          <w:b/>
+          <w:bCs/>
+        </w:rPr>
+        <w:t xml:space="preserve">”</w:t>
+      </w:r>
+      <w:r>
+        <w:t xml:space="preserve">:</w:t>
+      </w:r>
+      <w:r>
+        <w:t xml:space="preserve"> </w:t>
+      </w:r>
+      <w:r>
+        <w:t xml:space="preserve">Son incorrectas porque el problema no es falta de información, sino un error en el valor decimal usado</w:t>
+      </w:r>
+    </w:p>
+    <w:p>
+      <w:pPr>
+        <w:numPr>
+          <w:ilvl w:val="1"/>
+          <w:numId w:val="1006"/>
+        </w:numPr>
+      </w:pPr>
+      <w:r>
+        <w:rPr>
+          <w:b/>
+          <w:bCs/>
+        </w:rPr>
+        <w:t xml:space="preserve">Opciones que requieren</w:t>
+      </w:r>
+      <w:r>
+        <w:rPr>
+          <w:b/>
+          <w:bCs/>
+        </w:rPr>
+        <w:t xml:space="preserve"> </w:t>
+      </w:r>
+      <w:r>
+        <w:rPr>
+          <w:b/>
+          <w:bCs/>
+        </w:rPr>
+        <w:t xml:space="preserve">“</w:t>
+      </w:r>
+      <w:r>
+        <w:rPr>
+          <w:b/>
+          <w:bCs/>
+        </w:rPr>
+        <w:t xml:space="preserve">números exactos</w:t>
+      </w:r>
+      <w:r>
+        <w:rPr>
+          <w:b/>
+          <w:bCs/>
+        </w:rPr>
+        <w:t xml:space="preserve">”</w:t>
+      </w:r>
+      <w:r>
+        <w:t xml:space="preserve">:</w:t>
+      </w:r>
+      <w:r>
+        <w:t xml:space="preserve"> </w:t>
+      </w:r>
+      <w:r>
+        <w:t xml:space="preserve">Son incorrectas porque no abordan el error principal del procedimiento</w:t>
+      </w:r>
+    </w:p>
+    <w:p>
+      <w:pPr>
+        <w:pStyle w:val="Heading3"/>
+        <w:numPr>
+          <w:ilvl w:val="0"/>
+          <w:numId w:val="1000"/>
+        </w:numPr>
+      </w:pPr>
+      <w:bookmarkStart w:id="26" w:name="conclusiuxf3n"/>
+      <w:r>
+        <w:t xml:space="preserve">Conclusión</w:t>
+      </w:r>
+      <w:bookmarkEnd w:id="26"/>
+    </w:p>
+    <w:p>
+      <w:pPr>
+        <w:numPr>
+          <w:ilvl w:val="0"/>
+          <w:numId w:val="1000"/>
+        </w:numPr>
+      </w:pPr>
+      <w:r>
+        <w:t xml:space="preserve">El procedimiento sugerido es</w:t>
+      </w:r>
+      <w:r>
+        <w:t xml:space="preserve"> </w:t>
+      </w:r>
+      <w:r>
+        <w:rPr>
+          <w:b/>
+          <w:bCs/>
+        </w:rPr>
+        <w:t xml:space="preserve">incorrecto</w:t>
+      </w:r>
+      <w:r>
+        <w:t xml:space="preserve"> </w:t>
+      </w:r>
+      <w:r>
+        <w:t xml:space="preserve">porque usa 0.6 en lugar de 0.06. La respuesta correcta identifica este error y proporciona el valor decimal correcto que debe usarse.</w:t>
+      </w:r>
+    </w:p>
+    <w:p>
+      <w:pPr>
+        <w:numPr>
+          <w:ilvl w:val="1"/>
+          <w:numId w:val="1007"/>
+        </w:numPr>
+      </w:pPr>
+      <w:r>
+        <w:t xml:space="preserve">Falso</w:t>
+      </w:r>
+    </w:p>
+    <w:p>
+      <w:pPr>
+        <w:numPr>
+          <w:ilvl w:val="1"/>
+          <w:numId w:val="1007"/>
+        </w:numPr>
+      </w:pPr>
+      <w:r>
+        <w:t xml:space="preserve">Verdadero</w:t>
+      </w:r>
+    </w:p>
+    <w:p>
+      <w:pPr>
+        <w:numPr>
+          <w:ilvl w:val="1"/>
+          <w:numId w:val="1007"/>
+        </w:numPr>
+      </w:pPr>
+      <w:r>
+        <w:t xml:space="preserve">Falso</w:t>
+      </w:r>
+    </w:p>
+    <w:p>
+      <w:pPr>
+        <w:numPr>
+          <w:ilvl w:val="1"/>
+          <w:numId w:val="1007"/>
+        </w:numPr>
+      </w:pPr>
+      <w:r>
+        <w:t xml:space="preserve">Falso</w:t>
+      </w:r>
+    </w:p>
+    <w:p>
+      <w:pPr>
+        <w:numPr>
+          <w:ilvl w:val="0"/>
+          <w:numId w:val="1001"/>
+        </w:numPr>
+      </w:pPr>
+      <w:r>
+        <w:rPr>
+          <w:b/>
+          <w:bCs/>
+        </w:rPr>
+        <w:t xml:space="preserve">Escenario</w:t>
+      </w:r>
+      <w:r>
+        <w:br/>
+      </w:r>
+      <w:r>
+        <w:t xml:space="preserve">los Juegos Suramericanos se realizan cada cuatro años con la participación de países de Suramérica, alternando las sedes deportivas. La tabla muestra algunos datos de las últimas cinco versiones de los Juegos Suramericanos:</w:t>
+      </w:r>
+    </w:p>
+    <w:p>
+      <w:pPr>
+        <w:numPr>
+          <w:ilvl w:val="0"/>
+          <w:numId w:val="1000"/>
+        </w:numPr>
+      </w:pPr>
+      <w:r>
+        <w:drawing>
+          <wp:inline>
+            <wp:extent cx="4267200" cy="2540205"/>
+            <wp:effectExtent b="0" l="0" r="0" t="0"/>
+            <wp:docPr descr="image" title="" id="28" name="Picture"/>
+            <a:graphic>
+              <a:graphicData uri="http://schemas.openxmlformats.org/drawingml/2006/picture">
+                <pic:pic>
+                  <pic:nvPicPr>
+                    <pic:cNvPr descr="media/supplements1/exercise2/tabla_datos_deportivos.png" id="29" name="Picture"/>
+                    <pic:cNvPicPr>
+                      <a:picLocks noChangeArrowheads="1" noChangeAspect="1"/>
+                    </pic:cNvPicPr>
+                  </pic:nvPicPr>
+                  <pic:blipFill>
+                    <a:blip r:embed="rId27"/>
                     <a:stretch>
                       <a:fillRect/>
                     </a:stretch>
@@ -114,25 +884,25 @@
         </w:numPr>
       </w:pPr>
       <w:r>
-        <w:t xml:space="preserve">Del total de atletas participantes en 2024, el 5% compite en atletismo. Para determinar el número de atletas de atletismo ese año, se sugiere multiplicar 0.5 por el número de atletas que participaron en 2024. El procedimiento sugerido es:</w:t>
-      </w:r>
-    </w:p>
-    <w:p>
-      <w:pPr>
-        <w:numPr>
-          <w:ilvl w:val="1"/>
-          <w:numId w:val="1002"/>
-        </w:numPr>
-      </w:pPr>
-      <w:r>
-        <w:t xml:space="preserve">insuficiente, porque falta multiplicar el resultado por el número de países participantes en 2024</w:t>
-      </w:r>
-    </w:p>
-    <w:p>
-      <w:pPr>
-        <w:numPr>
-          <w:ilvl w:val="1"/>
-          <w:numId w:val="1002"/>
+        <w:t xml:space="preserve">Del total de atletas participantes en 2016, el 8% compite en gimnasia. Para determinar el número de atletas de gimnasia ese año, se sugiere multiplicar 0.8 por el número de atletas que participaron en 2016. El procedimiento sugerido es:</w:t>
+      </w:r>
+    </w:p>
+    <w:p>
+      <w:pPr>
+        <w:numPr>
+          <w:ilvl w:val="1"/>
+          <w:numId w:val="1008"/>
+        </w:numPr>
+      </w:pPr>
+      <w:r>
+        <w:t xml:space="preserve">incorrecto, porque se debe multiplicar 0.08 por el número de atletas participantes</w:t>
+      </w:r>
+    </w:p>
+    <w:p>
+      <w:pPr>
+        <w:numPr>
+          <w:ilvl w:val="1"/>
+          <w:numId w:val="1008"/>
         </w:numPr>
       </w:pPr>
       <w:r>
@@ -143,7 +913,18 @@
       <w:pPr>
         <w:numPr>
           <w:ilvl w:val="1"/>
-          <w:numId w:val="1002"/>
+          <w:numId w:val="1008"/>
+        </w:numPr>
+      </w:pPr>
+      <w:r>
+        <w:t xml:space="preserve">insuficiente, porque se debe calcular el promedio de atletas por país participante</w:t>
+      </w:r>
+    </w:p>
+    <w:p>
+      <w:pPr>
+        <w:numPr>
+          <w:ilvl w:val="1"/>
+          <w:numId w:val="1008"/>
         </w:numPr>
       </w:pPr>
       <w:r>
@@ -153,17 +934,6 @@
     <w:p>
       <w:pPr>
         <w:numPr>
-          <w:ilvl w:val="1"/>
-          <w:numId w:val="1002"/>
-        </w:numPr>
-      </w:pPr>
-      <w:r>
-        <w:t xml:space="preserve">incorrecto, porque se debe multiplicar 0.05 por el número de atletas participantes</w:t>
-      </w:r>
-    </w:p>
-    <w:p>
-      <w:pPr>
-        <w:numPr>
           <w:ilvl w:val="0"/>
           <w:numId w:val="1000"/>
         </w:numPr>
@@ -179,7 +949,7 @@
         <w:br/>
       </w:r>
       <w:r>
-        <w:t xml:space="preserve">Para resolver este problema, necesitamos evaluar si el procedimiento propuesto para calcular el número de atletas que compiten en atletismo es matemáticamente correcto.</w:t>
+        <w:t xml:space="preserve">Para resolver este problema, necesitamos evaluar si el procedimiento propuesto para calcular el número de atletas que compiten en gimnasia es matemáticamente correcto.</w:t>
       </w:r>
     </w:p>
     <w:p>
@@ -190,11 +960,11 @@
           <w:numId w:val="1000"/>
         </w:numPr>
       </w:pPr>
-      <w:bookmarkStart w:id="23" w:name="anuxe1lisis-del-procedimiento-propuesto"/>
+      <w:bookmarkStart w:id="30" w:name="anuxe1lisis-del-procedimiento-propuesto"/>
       <w:r>
         <w:t xml:space="preserve">Análisis del procedimiento propuesto</w:t>
       </w:r>
-      <w:bookmarkEnd w:id="23"/>
+      <w:bookmarkEnd w:id="30"/>
     </w:p>
     <w:p>
       <w:pPr>
@@ -215,33 +985,33 @@
       <w:pPr>
         <w:numPr>
           <w:ilvl w:val="1"/>
-          <w:numId w:val="1003"/>
-        </w:numPr>
-      </w:pPr>
-      <w:r>
-        <w:t xml:space="preserve">Total de atletas en 2024: 7.882</w:t>
-      </w:r>
-    </w:p>
-    <w:p>
-      <w:pPr>
-        <w:numPr>
-          <w:ilvl w:val="1"/>
-          <w:numId w:val="1003"/>
-        </w:numPr>
-      </w:pPr>
-      <w:r>
-        <w:t xml:space="preserve">Porcentaje que compite en atletismo: 5%</w:t>
-      </w:r>
-    </w:p>
-    <w:p>
-      <w:pPr>
-        <w:numPr>
-          <w:ilvl w:val="1"/>
-          <w:numId w:val="1003"/>
-        </w:numPr>
-      </w:pPr>
-      <w:r>
-        <w:t xml:space="preserve">Procedimiento sugerido: multiplicar 0.5 por 7.882</w:t>
+          <w:numId w:val="1009"/>
+        </w:numPr>
+      </w:pPr>
+      <w:r>
+        <w:t xml:space="preserve">Total de atletas en 2016: 6.669</w:t>
+      </w:r>
+    </w:p>
+    <w:p>
+      <w:pPr>
+        <w:numPr>
+          <w:ilvl w:val="1"/>
+          <w:numId w:val="1009"/>
+        </w:numPr>
+      </w:pPr>
+      <w:r>
+        <w:t xml:space="preserve">Porcentaje que compite en gimnasia: 8%</w:t>
+      </w:r>
+    </w:p>
+    <w:p>
+      <w:pPr>
+        <w:numPr>
+          <w:ilvl w:val="1"/>
+          <w:numId w:val="1009"/>
+        </w:numPr>
+      </w:pPr>
+      <w:r>
+        <w:t xml:space="preserve">Procedimiento sugerido: multiplicar 0.8 por 6.669</w:t>
       </w:r>
     </w:p>
     <w:p>
@@ -252,11 +1022,11 @@
           <w:numId w:val="1000"/>
         </w:numPr>
       </w:pPr>
-      <w:bookmarkStart w:id="24" w:name="X27d6c5c273dc4a3785c7f87f825fb56e431524d"/>
+      <w:bookmarkStart w:id="31" w:name="X27d6c5c273dc4a3785c7f87f825fb56e431524d"/>
       <w:r>
         <w:t xml:space="preserve">Identificación del error en el procedimiento</w:t>
       </w:r>
-      <w:bookmarkEnd w:id="24"/>
+      <w:bookmarkEnd w:id="31"/>
     </w:p>
     <w:p>
       <w:pPr>
@@ -281,7 +1051,7 @@
         </w:numPr>
       </w:pPr>
       <w:r>
-        <w:t xml:space="preserve">El procedimiento propone multiplicar 0.5 por el total de atletas, pero esto es</w:t>
+        <w:t xml:space="preserve">El procedimiento propone multiplicar 0.8 por el total de atletas, pero esto es</w:t>
       </w:r>
       <w:r>
         <w:t xml:space="preserve"> </w:t>
@@ -327,18 +1097,18 @@
       <w:pPr>
         <w:numPr>
           <w:ilvl w:val="1"/>
-          <w:numId w:val="1004"/>
-        </w:numPr>
-      </w:pPr>
-      <w:r>
-        <w:t xml:space="preserve">5% = 0.05 (no 0.5)</w:t>
-      </w:r>
-    </w:p>
-    <w:p>
-      <w:pPr>
-        <w:numPr>
-          <w:ilvl w:val="1"/>
-          <w:numId w:val="1004"/>
+          <w:numId w:val="1010"/>
+        </w:numPr>
+      </w:pPr>
+      <w:r>
+        <w:t xml:space="preserve">8% = 0.08 (no 0.8)</w:t>
+      </w:r>
+    </w:p>
+    <w:p>
+      <w:pPr>
+        <w:numPr>
+          <w:ilvl w:val="1"/>
+          <w:numId w:val="1010"/>
         </w:numPr>
       </w:pPr>
       <w:r>
@@ -352,7 +1122,7 @@
         <w:t xml:space="preserve"> </w:t>
       </w:r>
       <w:r>
-        <w:t xml:space="preserve">5% de 7.882 = 0.05 × 7.882 = 394</w:t>
+        <w:t xml:space="preserve">8% de 6.669 = 0.08 × 6.669 = 534</w:t>
       </w:r>
     </w:p>
     <w:p>
@@ -373,7 +1143,7 @@
         <w:t xml:space="preserve"> </w:t>
       </w:r>
       <w:r>
-        <w:t xml:space="preserve">0.5 × 7.882 = 3.941 (esto sería el 50%, no el 5%)</w:t>
+        <w:t xml:space="preserve">0.8 × 6.669 = 5.335 (esto sería el 80%, no el 8%)</w:t>
       </w:r>
     </w:p>
     <w:p>
@@ -384,11 +1154,11 @@
           <w:numId w:val="1000"/>
         </w:numPr>
       </w:pPr>
-      <w:bookmarkStart w:id="25" w:name="evaluaciuxf3n-de-cada-opciuxf3n"/>
+      <w:bookmarkStart w:id="32" w:name="evaluaciuxf3n-de-cada-opciuxf3n"/>
       <w:r>
         <w:t xml:space="preserve">Evaluación de cada opción</w:t>
       </w:r>
-      <w:bookmarkEnd w:id="25"/>
+      <w:bookmarkEnd w:id="32"/>
     </w:p>
     <w:p>
       <w:pPr>
@@ -436,29 +1206,29 @@
       <w:pPr>
         <w:numPr>
           <w:ilvl w:val="1"/>
-          <w:numId w:val="1005"/>
-        </w:numPr>
-      </w:pPr>
-      <w:r>
-        <w:t xml:space="preserve">El valor 0.5 corresponde al 50%, no al 5%</w:t>
-      </w:r>
-    </w:p>
-    <w:p>
-      <w:pPr>
-        <w:numPr>
-          <w:ilvl w:val="1"/>
-          <w:numId w:val="1005"/>
-        </w:numPr>
-      </w:pPr>
-      <w:r>
-        <w:t xml:space="preserve">Para calcular el 5% se debe usar 0.05, no 0.5</w:t>
-      </w:r>
-    </w:p>
-    <w:p>
-      <w:pPr>
-        <w:numPr>
-          <w:ilvl w:val="1"/>
-          <w:numId w:val="1005"/>
+          <w:numId w:val="1011"/>
+        </w:numPr>
+      </w:pPr>
+      <w:r>
+        <w:t xml:space="preserve">El valor 0.8 corresponde al 80%, no al 8%</w:t>
+      </w:r>
+    </w:p>
+    <w:p>
+      <w:pPr>
+        <w:numPr>
+          <w:ilvl w:val="1"/>
+          <w:numId w:val="1011"/>
+        </w:numPr>
+      </w:pPr>
+      <w:r>
+        <w:t xml:space="preserve">Para calcular el 8% se debe usar 0.08, no 0.8</w:t>
+      </w:r>
+    </w:p>
+    <w:p>
+      <w:pPr>
+        <w:numPr>
+          <w:ilvl w:val="1"/>
+          <w:numId w:val="1011"/>
         </w:numPr>
       </w:pPr>
       <w:r>
@@ -484,7 +1254,7 @@
       <w:pPr>
         <w:numPr>
           <w:ilvl w:val="1"/>
-          <w:numId w:val="1006"/>
+          <w:numId w:val="1012"/>
         </w:numPr>
       </w:pPr>
       <w:r>
@@ -506,7 +1276,21 @@
           <w:b/>
           <w:bCs/>
         </w:rPr>
-        <w:t xml:space="preserve">“suficiente”</w:t>
+        <w:t xml:space="preserve">“</w:t>
+      </w:r>
+      <w:r>
+        <w:rPr>
+          <w:b/>
+          <w:bCs/>
+        </w:rPr>
+        <w:t xml:space="preserve">suficiente</w:t>
+      </w:r>
+      <w:r>
+        <w:rPr>
+          <w:b/>
+          <w:bCs/>
+        </w:rPr>
+        <w:t xml:space="preserve">”</w:t>
       </w:r>
       <w:r>
         <w:t xml:space="preserve">:</w:t>
@@ -522,7 +1306,7 @@
       <w:pPr>
         <w:numPr>
           <w:ilvl w:val="1"/>
-          <w:numId w:val="1006"/>
+          <w:numId w:val="1012"/>
         </w:numPr>
       </w:pPr>
       <w:r>
@@ -544,7 +1328,21 @@
           <w:b/>
           <w:bCs/>
         </w:rPr>
-        <w:t xml:space="preserve">“insuficiente”</w:t>
+        <w:t xml:space="preserve">“</w:t>
+      </w:r>
+      <w:r>
+        <w:rPr>
+          <w:b/>
+          <w:bCs/>
+        </w:rPr>
+        <w:t xml:space="preserve">insuficiente</w:t>
+      </w:r>
+      <w:r>
+        <w:rPr>
+          <w:b/>
+          <w:bCs/>
+        </w:rPr>
+        <w:t xml:space="preserve">”</w:t>
       </w:r>
       <w:r>
         <w:t xml:space="preserve">:</w:t>
@@ -560,7 +1358,7 @@
       <w:pPr>
         <w:numPr>
           <w:ilvl w:val="1"/>
-          <w:numId w:val="1006"/>
+          <w:numId w:val="1012"/>
         </w:numPr>
       </w:pPr>
       <w:r>
@@ -582,7 +1380,21 @@
           <w:b/>
           <w:bCs/>
         </w:rPr>
-        <w:t xml:space="preserve">“números exactos”</w:t>
+        <w:t xml:space="preserve">“</w:t>
+      </w:r>
+      <w:r>
+        <w:rPr>
+          <w:b/>
+          <w:bCs/>
+        </w:rPr>
+        <w:t xml:space="preserve">números exactos</w:t>
+      </w:r>
+      <w:r>
+        <w:rPr>
+          <w:b/>
+          <w:bCs/>
+        </w:rPr>
+        <w:t xml:space="preserve">”</w:t>
       </w:r>
       <w:r>
         <w:t xml:space="preserve">:</w:t>
@@ -602,11 +1414,11 @@
           <w:numId w:val="1000"/>
         </w:numPr>
       </w:pPr>
-      <w:bookmarkStart w:id="26" w:name="conclusiuxf3n"/>
+      <w:bookmarkStart w:id="33" w:name="conclusiuxf3n"/>
       <w:r>
         <w:t xml:space="preserve">Conclusión</w:t>
       </w:r>
-      <w:bookmarkEnd w:id="26"/>
+      <w:bookmarkEnd w:id="33"/>
     </w:p>
     <w:p>
       <w:pPr>
@@ -632,14 +1444,25 @@
         <w:t xml:space="preserve"> </w:t>
       </w:r>
       <w:r>
-        <w:t xml:space="preserve">porque usa 0.5 en lugar de 0.05. La respuesta correcta identifica este error y proporciona el valor decimal correcto que debe usarse.</w:t>
-      </w:r>
-    </w:p>
-    <w:p>
-      <w:pPr>
-        <w:numPr>
-          <w:ilvl w:val="1"/>
-          <w:numId w:val="1007"/>
+        <w:t xml:space="preserve">porque usa 0.8 en lugar de 0.08. La respuesta correcta identifica este error y proporciona el valor decimal correcto que debe usarse.</w:t>
+      </w:r>
+    </w:p>
+    <w:p>
+      <w:pPr>
+        <w:numPr>
+          <w:ilvl w:val="1"/>
+          <w:numId w:val="1013"/>
+        </w:numPr>
+      </w:pPr>
+      <w:r>
+        <w:t xml:space="preserve">Verdadero</w:t>
+      </w:r>
+    </w:p>
+    <w:p>
+      <w:pPr>
+        <w:numPr>
+          <w:ilvl w:val="1"/>
+          <w:numId w:val="1013"/>
         </w:numPr>
       </w:pPr>
       <w:r>
@@ -650,7 +1473,7 @@
       <w:pPr>
         <w:numPr>
           <w:ilvl w:val="1"/>
-          <w:numId w:val="1007"/>
+          <w:numId w:val="1013"/>
         </w:numPr>
       </w:pPr>
       <w:r>
@@ -661,7 +1484,7 @@
       <w:pPr>
         <w:numPr>
           <w:ilvl w:val="1"/>
-          <w:numId w:val="1007"/>
+          <w:numId w:val="1013"/>
         </w:numPr>
       </w:pPr>
       <w:r>
@@ -671,17 +1494,6 @@
     <w:p>
       <w:pPr>
         <w:numPr>
-          <w:ilvl w:val="1"/>
-          <w:numId w:val="1007"/>
-        </w:numPr>
-      </w:pPr>
-      <w:r>
-        <w:t xml:space="preserve">Verdadero</w:t>
-      </w:r>
-    </w:p>
-    <w:p>
-      <w:pPr>
-        <w:numPr>
           <w:ilvl w:val="0"/>
           <w:numId w:val="1001"/>
         </w:numPr>
@@ -697,651 +1509,7 @@
         <w:br/>
       </w:r>
       <w:r>
-        <w:t xml:space="preserve">los Juegos Mediterráneos se realizan cada cuatro años con la participación de países de Mediterráneo, alternando las sedes deportivas. La tabla muestra algunos datos de las últimas cinco versiones de los Juegos Mediterráneos:</w:t>
-      </w:r>
-    </w:p>
-    <w:p>
-      <w:pPr>
-        <w:numPr>
-          <w:ilvl w:val="0"/>
-          <w:numId w:val="1000"/>
-        </w:numPr>
-      </w:pPr>
-      <w:r>
-        <w:drawing>
-          <wp:inline>
-            <wp:extent cx="4267200" cy="2537331"/>
-            <wp:effectExtent b="0" l="0" r="0" t="0"/>
-            <wp:docPr descr="image" title="" id="28" name="Picture"/>
-            <a:graphic>
-              <a:graphicData uri="http://schemas.openxmlformats.org/drawingml/2006/picture">
-                <pic:pic>
-                  <pic:nvPicPr>
-                    <pic:cNvPr descr="media/supplements1/exercise2/tabla_datos_deportivos.png" id="29" name="Picture"/>
-                    <pic:cNvPicPr>
-                      <a:picLocks noChangeArrowheads="1" noChangeAspect="1"/>
-                    </pic:cNvPicPr>
-                  </pic:nvPicPr>
-                  <pic:blipFill>
-                    <a:blip r:embed="rId27"/>
-                    <a:stretch>
-                      <a:fillRect/>
-                    </a:stretch>
-                  </pic:blipFill>
-                  <pic:spPr bwMode="auto">
-                    <a:xfrm>
-                      <a:off x="0" y="0"/>
-                      <a:ext cx="4267200" cy="2537331"/>
-                    </a:xfrm>
-                    <a:prstGeom prst="rect">
-                      <a:avLst/>
-                    </a:prstGeom>
-                    <a:noFill/>
-                    <a:ln w="9525">
-                      <a:noFill/>
-                      <a:headEnd/>
-                      <a:tailEnd/>
-                    </a:ln>
-                  </pic:spPr>
-                </pic:pic>
-              </a:graphicData>
-            </a:graphic>
-          </wp:inline>
-        </w:drawing>
-      </w:r>
-    </w:p>
-    <w:p>
-      <w:pPr>
-        <w:numPr>
-          <w:ilvl w:val="0"/>
-          <w:numId w:val="1000"/>
-        </w:numPr>
-      </w:pPr>
-      <w:r>
-        <w:t xml:space="preserve">Del total de atletas participantes en 2015, el 6% compite en atletismo. Para determinar el número de atletas de atletismo ese año, se sugiere multiplicar 0.6 por el número de atletas que participaron en 2015. El procedimiento sugerido es:</w:t>
-      </w:r>
-    </w:p>
-    <w:p>
-      <w:pPr>
-        <w:numPr>
-          <w:ilvl w:val="1"/>
-          <w:numId w:val="1008"/>
-        </w:numPr>
-      </w:pPr>
-      <w:r>
-        <w:t xml:space="preserve">suficiente para determinar el número de atletas que participó en atletismo en el año 2015</w:t>
-      </w:r>
-    </w:p>
-    <w:p>
-      <w:pPr>
-        <w:numPr>
-          <w:ilvl w:val="1"/>
-          <w:numId w:val="1008"/>
-        </w:numPr>
-      </w:pPr>
-      <w:r>
-        <w:t xml:space="preserve">correcto, pero solo si se redondea al número entero más cercano de competidores</w:t>
-      </w:r>
-    </w:p>
-    <w:p>
-      <w:pPr>
-        <w:numPr>
-          <w:ilvl w:val="1"/>
-          <w:numId w:val="1008"/>
-        </w:numPr>
-      </w:pPr>
-      <w:r>
-        <w:t xml:space="preserve">incorrecto, porque se debe multiplicar 0.06 por el número de atletas participantes</w:t>
-      </w:r>
-    </w:p>
-    <w:p>
-      <w:pPr>
-        <w:numPr>
-          <w:ilvl w:val="1"/>
-          <w:numId w:val="1008"/>
-        </w:numPr>
-      </w:pPr>
-      <w:r>
-        <w:t xml:space="preserve">insuficiente, porque falta multiplicar el resultado por el número de países participantes en 2015</w:t>
-      </w:r>
-    </w:p>
-    <w:p>
-      <w:pPr>
-        <w:numPr>
-          <w:ilvl w:val="0"/>
-          <w:numId w:val="1000"/>
-        </w:numPr>
-      </w:pPr>
-      <w:r>
-        <w:rPr>
-          <w:b/>
-          <w:bCs/>
-        </w:rPr>
-        <w:t xml:space="preserve">Solución</w:t>
-      </w:r>
-      <w:r>
-        <w:br/>
-      </w:r>
-      <w:r>
-        <w:t xml:space="preserve">Para resolver este problema, necesitamos evaluar si el procedimiento propuesto para calcular el número de atletas que compiten en atletismo es matemáticamente correcto.</w:t>
-      </w:r>
-    </w:p>
-    <w:p>
-      <w:pPr>
-        <w:pStyle w:val="Heading3"/>
-        <w:numPr>
-          <w:ilvl w:val="0"/>
-          <w:numId w:val="1000"/>
-        </w:numPr>
-      </w:pPr>
-      <w:bookmarkStart w:id="30" w:name="anuxe1lisis-del-procedimiento-propuesto"/>
-      <w:r>
-        <w:t xml:space="preserve">Análisis del procedimiento propuesto</w:t>
-      </w:r>
-      <w:bookmarkEnd w:id="30"/>
-    </w:p>
-    <w:p>
-      <w:pPr>
-        <w:numPr>
-          <w:ilvl w:val="0"/>
-          <w:numId w:val="1000"/>
-        </w:numPr>
-      </w:pPr>
-      <w:r>
-        <w:rPr>
-          <w:b/>
-          <w:bCs/>
-        </w:rPr>
-        <w:t xml:space="preserve">Datos disponibles:</w:t>
-      </w:r>
-    </w:p>
-    <w:p>
-      <w:pPr>
-        <w:numPr>
-          <w:ilvl w:val="1"/>
-          <w:numId w:val="1009"/>
-        </w:numPr>
-      </w:pPr>
-      <w:r>
-        <w:t xml:space="preserve">Total de atletas en 2015: 7.066</w:t>
-      </w:r>
-    </w:p>
-    <w:p>
-      <w:pPr>
-        <w:numPr>
-          <w:ilvl w:val="1"/>
-          <w:numId w:val="1009"/>
-        </w:numPr>
-      </w:pPr>
-      <w:r>
-        <w:t xml:space="preserve">Porcentaje que compite en atletismo: 6%</w:t>
-      </w:r>
-    </w:p>
-    <w:p>
-      <w:pPr>
-        <w:numPr>
-          <w:ilvl w:val="1"/>
-          <w:numId w:val="1009"/>
-        </w:numPr>
-      </w:pPr>
-      <w:r>
-        <w:t xml:space="preserve">Procedimiento sugerido: multiplicar 0.6 por 7.066</w:t>
-      </w:r>
-    </w:p>
-    <w:p>
-      <w:pPr>
-        <w:pStyle w:val="Heading3"/>
-        <w:numPr>
-          <w:ilvl w:val="0"/>
-          <w:numId w:val="1000"/>
-        </w:numPr>
-      </w:pPr>
-      <w:bookmarkStart w:id="31" w:name="X27d6c5c273dc4a3785c7f87f825fb56e431524d"/>
-      <w:r>
-        <w:t xml:space="preserve">Identificación del error en el procedimiento</w:t>
-      </w:r>
-      <w:bookmarkEnd w:id="31"/>
-    </w:p>
-    <w:p>
-      <w:pPr>
-        <w:numPr>
-          <w:ilvl w:val="0"/>
-          <w:numId w:val="1000"/>
-        </w:numPr>
-      </w:pPr>
-      <w:r>
-        <w:rPr>
-          <w:b/>
-          <w:bCs/>
-        </w:rPr>
-        <w:t xml:space="preserve">Error en el procedimiento sugerido:</w:t>
-      </w:r>
-    </w:p>
-    <w:p>
-      <w:pPr>
-        <w:numPr>
-          <w:ilvl w:val="0"/>
-          <w:numId w:val="1000"/>
-        </w:numPr>
-      </w:pPr>
-      <w:r>
-        <w:t xml:space="preserve">El procedimiento propone multiplicar 0.6 por el total de atletas, pero esto es</w:t>
-      </w:r>
-      <w:r>
-        <w:t xml:space="preserve"> </w:t>
-      </w:r>
-      <w:r>
-        <w:rPr>
-          <w:b/>
-          <w:bCs/>
-        </w:rPr>
-        <w:t xml:space="preserve">INCORRECTO</w:t>
-      </w:r>
-      <w:r>
-        <w:t xml:space="preserve">.</w:t>
-      </w:r>
-    </w:p>
-    <w:p>
-      <w:pPr>
-        <w:numPr>
-          <w:ilvl w:val="0"/>
-          <w:numId w:val="1000"/>
-        </w:numPr>
-      </w:pPr>
-      <w:r>
-        <w:rPr>
-          <w:b/>
-          <w:bCs/>
-        </w:rPr>
-        <w:t xml:space="preserve">Procedimiento correcto:</w:t>
-      </w:r>
-    </w:p>
-    <w:p>
-      <w:pPr>
-        <w:numPr>
-          <w:ilvl w:val="0"/>
-          <w:numId w:val="1000"/>
-        </w:numPr>
-      </w:pPr>
-      <w:r>
-        <w:t xml:space="preserve">El cálculo de un porcentaje de una cantidad total se realiza multiplicando el porcentaje (expresado como decimal) por la cantidad total:</w:t>
-      </w:r>
-    </w:p>
-    <w:p>
-      <w:pPr>
-        <w:numPr>
-          <w:ilvl w:val="1"/>
-          <w:numId w:val="1010"/>
-        </w:numPr>
-      </w:pPr>
-      <w:r>
-        <w:t xml:space="preserve">6% = 0.06 (no 0.6)</w:t>
-      </w:r>
-    </w:p>
-    <w:p>
-      <w:pPr>
-        <w:numPr>
-          <w:ilvl w:val="1"/>
-          <w:numId w:val="1010"/>
-        </w:numPr>
-      </w:pPr>
-      <w:r>
-        <w:rPr>
-          <w:b/>
-          <w:bCs/>
-        </w:rPr>
-        <w:t xml:space="preserve">Cálculo correcto:</w:t>
-      </w:r>
-      <w:r>
-        <w:t xml:space="preserve"> </w:t>
-      </w:r>
-      <w:r>
-        <w:t xml:space="preserve">6% de 7.066 = 0.06 × 7.066 = 424</w:t>
-      </w:r>
-    </w:p>
-    <w:p>
-      <w:pPr>
-        <w:numPr>
-          <w:ilvl w:val="0"/>
-          <w:numId w:val="1000"/>
-        </w:numPr>
-      </w:pPr>
-      <w:r>
-        <w:rPr>
-          <w:b/>
-          <w:bCs/>
-        </w:rPr>
-        <w:t xml:space="preserve">Cálculo con el procedimiento incorrecto sugerido:</w:t>
-      </w:r>
-      <w:r>
-        <w:t xml:space="preserve"> </w:t>
-      </w:r>
-      <w:r>
-        <w:t xml:space="preserve">0.6 × 7.066 = 4.240 (esto sería el 60%, no el 6%)</w:t>
-      </w:r>
-    </w:p>
-    <w:p>
-      <w:pPr>
-        <w:pStyle w:val="Heading3"/>
-        <w:numPr>
-          <w:ilvl w:val="0"/>
-          <w:numId w:val="1000"/>
-        </w:numPr>
-      </w:pPr>
-      <w:bookmarkStart w:id="32" w:name="evaluaciuxf3n-de-cada-opciuxf3n"/>
-      <w:r>
-        <w:t xml:space="preserve">Evaluación de cada opción</w:t>
-      </w:r>
-      <w:bookmarkEnd w:id="32"/>
-    </w:p>
-    <w:p>
-      <w:pPr>
-        <w:numPr>
-          <w:ilvl w:val="0"/>
-          <w:numId w:val="1000"/>
-        </w:numPr>
-      </w:pPr>
-      <w:r>
-        <w:rPr>
-          <w:b/>
-          <w:bCs/>
-        </w:rPr>
-        <w:t xml:space="preserve">Análisis de la respuesta correcta:</w:t>
-      </w:r>
-    </w:p>
-    <w:p>
-      <w:pPr>
-        <w:numPr>
-          <w:ilvl w:val="0"/>
-          <w:numId w:val="1000"/>
-        </w:numPr>
-      </w:pPr>
-      <w:r>
-        <w:t xml:space="preserve">La respuesta correcta identifica que el procedimiento es</w:t>
-      </w:r>
-      <w:r>
-        <w:t xml:space="preserve"> </w:t>
-      </w:r>
-      <w:r>
-        <w:rPr>
-          <w:b/>
-          <w:bCs/>
-        </w:rPr>
-        <w:t xml:space="preserve">incorrecto</w:t>
-      </w:r>
-      <w:r>
-        <w:t xml:space="preserve"> </w:t>
-      </w:r>
-      <w:r>
-        <w:t xml:space="preserve">porque:</w:t>
-      </w:r>
-    </w:p>
-    <w:p>
-      <w:pPr>
-        <w:numPr>
-          <w:ilvl w:val="1"/>
-          <w:numId w:val="1011"/>
-        </w:numPr>
-      </w:pPr>
-      <w:r>
-        <w:t xml:space="preserve">El valor 0.6 corresponde al 60%, no al 6%</w:t>
-      </w:r>
-    </w:p>
-    <w:p>
-      <w:pPr>
-        <w:numPr>
-          <w:ilvl w:val="1"/>
-          <w:numId w:val="1011"/>
-        </w:numPr>
-      </w:pPr>
-      <w:r>
-        <w:t xml:space="preserve">Para calcular el 6% se debe usar 0.06, no 0.6</w:t>
-      </w:r>
-    </w:p>
-    <w:p>
-      <w:pPr>
-        <w:numPr>
-          <w:ilvl w:val="1"/>
-          <w:numId w:val="1011"/>
-        </w:numPr>
-      </w:pPr>
-      <w:r>
-        <w:t xml:space="preserve">El error es confundir la representación decimal del porcentaje</w:t>
-      </w:r>
-    </w:p>
-    <w:p>
-      <w:pPr>
-        <w:numPr>
-          <w:ilvl w:val="0"/>
-          <w:numId w:val="1000"/>
-        </w:numPr>
-      </w:pPr>
-      <w:r>
-        <w:rPr>
-          <w:b/>
-          <w:bCs/>
-        </w:rPr>
-        <w:t xml:space="preserve">Análisis de los distractores:</w:t>
-      </w:r>
-    </w:p>
-    <w:p>
-      <w:pPr>
-        <w:numPr>
-          <w:ilvl w:val="1"/>
-          <w:numId w:val="1012"/>
-        </w:numPr>
-      </w:pPr>
-      <w:r>
-        <w:rPr>
-          <w:b/>
-          <w:bCs/>
-        </w:rPr>
-        <w:t xml:space="preserve">Opciones que mencionan</w:t>
-      </w:r>
-      <w:r>
-        <w:rPr>
-          <w:b/>
-          <w:bCs/>
-        </w:rPr>
-        <w:t xml:space="preserve"> </w:t>
-      </w:r>
-      <w:r>
-        <w:rPr>
-          <w:b/>
-          <w:bCs/>
-        </w:rPr>
-        <w:t xml:space="preserve">“suficiente”</w:t>
-      </w:r>
-      <w:r>
-        <w:t xml:space="preserve">:</w:t>
-      </w:r>
-      <w:r>
-        <w:t xml:space="preserve"> </w:t>
-      </w:r>
-      <w:r>
-        <w:t xml:space="preserve">Son incorrectas porque no identifican el error fundamental en el procedimiento sugerido</w:t>
-      </w:r>
-    </w:p>
-    <w:p>
-      <w:pPr>
-        <w:numPr>
-          <w:ilvl w:val="1"/>
-          <w:numId w:val="1012"/>
-        </w:numPr>
-      </w:pPr>
-      <w:r>
-        <w:rPr>
-          <w:b/>
-          <w:bCs/>
-        </w:rPr>
-        <w:t xml:space="preserve">Opciones que mencionan</w:t>
-      </w:r>
-      <w:r>
-        <w:rPr>
-          <w:b/>
-          <w:bCs/>
-        </w:rPr>
-        <w:t xml:space="preserve"> </w:t>
-      </w:r>
-      <w:r>
-        <w:rPr>
-          <w:b/>
-          <w:bCs/>
-        </w:rPr>
-        <w:t xml:space="preserve">“insuficiente”</w:t>
-      </w:r>
-      <w:r>
-        <w:t xml:space="preserve">:</w:t>
-      </w:r>
-      <w:r>
-        <w:t xml:space="preserve"> </w:t>
-      </w:r>
-      <w:r>
-        <w:t xml:space="preserve">Son incorrectas porque el problema no es falta de información, sino un error en el valor decimal usado</w:t>
-      </w:r>
-    </w:p>
-    <w:p>
-      <w:pPr>
-        <w:numPr>
-          <w:ilvl w:val="1"/>
-          <w:numId w:val="1012"/>
-        </w:numPr>
-      </w:pPr>
-      <w:r>
-        <w:rPr>
-          <w:b/>
-          <w:bCs/>
-        </w:rPr>
-        <w:t xml:space="preserve">Opciones que requieren</w:t>
-      </w:r>
-      <w:r>
-        <w:rPr>
-          <w:b/>
-          <w:bCs/>
-        </w:rPr>
-        <w:t xml:space="preserve"> </w:t>
-      </w:r>
-      <w:r>
-        <w:rPr>
-          <w:b/>
-          <w:bCs/>
-        </w:rPr>
-        <w:t xml:space="preserve">“números exactos”</w:t>
-      </w:r>
-      <w:r>
-        <w:t xml:space="preserve">:</w:t>
-      </w:r>
-      <w:r>
-        <w:t xml:space="preserve"> </w:t>
-      </w:r>
-      <w:r>
-        <w:t xml:space="preserve">Son incorrectas porque no abordan el error principal del procedimiento</w:t>
-      </w:r>
-    </w:p>
-    <w:p>
-      <w:pPr>
-        <w:pStyle w:val="Heading3"/>
-        <w:numPr>
-          <w:ilvl w:val="0"/>
-          <w:numId w:val="1000"/>
-        </w:numPr>
-      </w:pPr>
-      <w:bookmarkStart w:id="33" w:name="conclusiuxf3n"/>
-      <w:r>
-        <w:t xml:space="preserve">Conclusión</w:t>
-      </w:r>
-      <w:bookmarkEnd w:id="33"/>
-    </w:p>
-    <w:p>
-      <w:pPr>
-        <w:numPr>
-          <w:ilvl w:val="0"/>
-          <w:numId w:val="1000"/>
-        </w:numPr>
-      </w:pPr>
-      <w:r>
-        <w:t xml:space="preserve">El procedimiento sugerido es</w:t>
-      </w:r>
-      <w:r>
-        <w:t xml:space="preserve"> </w:t>
-      </w:r>
-      <w:r>
-        <w:rPr>
-          <w:b/>
-          <w:bCs/>
-        </w:rPr>
-        <w:t xml:space="preserve">incorrecto</w:t>
-      </w:r>
-      <w:r>
-        <w:t xml:space="preserve"> </w:t>
-      </w:r>
-      <w:r>
-        <w:t xml:space="preserve">porque usa 0.6 en lugar de 0.06. La respuesta correcta identifica este error y proporciona el valor decimal correcto que debe usarse.</w:t>
-      </w:r>
-    </w:p>
-    <w:p>
-      <w:pPr>
-        <w:numPr>
-          <w:ilvl w:val="1"/>
-          <w:numId w:val="1013"/>
-        </w:numPr>
-      </w:pPr>
-      <w:r>
-        <w:t xml:space="preserve">Falso</w:t>
-      </w:r>
-    </w:p>
-    <w:p>
-      <w:pPr>
-        <w:numPr>
-          <w:ilvl w:val="1"/>
-          <w:numId w:val="1013"/>
-        </w:numPr>
-      </w:pPr>
-      <w:r>
-        <w:t xml:space="preserve">Falso</w:t>
-      </w:r>
-    </w:p>
-    <w:p>
-      <w:pPr>
-        <w:numPr>
-          <w:ilvl w:val="1"/>
-          <w:numId w:val="1013"/>
-        </w:numPr>
-      </w:pPr>
-      <w:r>
-        <w:t xml:space="preserve">Verdadero</w:t>
-      </w:r>
-    </w:p>
-    <w:p>
-      <w:pPr>
-        <w:numPr>
-          <w:ilvl w:val="1"/>
-          <w:numId w:val="1013"/>
-        </w:numPr>
-      </w:pPr>
-      <w:r>
-        <w:t xml:space="preserve">Falso</w:t>
-      </w:r>
-    </w:p>
-    <w:p>
-      <w:pPr>
-        <w:numPr>
-          <w:ilvl w:val="0"/>
-          <w:numId w:val="1001"/>
-        </w:numPr>
-      </w:pPr>
-      <w:r>
-        <w:rPr>
-          <w:b/>
-          <w:bCs/>
-        </w:rPr>
-        <w:t xml:space="preserve">Escenario</w:t>
-      </w:r>
-      <w:r>
-        <w:br/>
-      </w:r>
-      <w:r>
-        <w:t xml:space="preserve">los Juegos Panamericanos se realizan cada cuatro años con la participación de países de América, alternando las sedes deportivas. La tabla muestra algunos datos de las últimas cinco versiones de los Juegos Panamericanos:</w:t>
+        <w:t xml:space="preserve">el Campeonato Mundial de Atletismo se realizan cada cuatro años con la participación de países de mundial, alternando las sedes deportivas. La tabla muestra algunos datos de las últimas cinco versiones de el Campeonato Mundial de Atletismo:</w:t>
       </w:r>
     </w:p>
     <w:p>
@@ -1402,7 +1570,7 @@
         </w:numPr>
       </w:pPr>
       <w:r>
-        <w:t xml:space="preserve">Del total de atletas participantes en 2021, el 5% compite en remo. Para determinar el número de atletas de remo ese año, se sugiere multiplicar 0.5 por el número de atletas que participaron en 2021. El procedimiento sugerido es:</w:t>
+        <w:t xml:space="preserve">Del total de atletas participantes en 2023, el 9% compite en atletismo. Para determinar el número de atletas de atletismo ese año, se sugiere multiplicar 0.9 por el número de atletas que participaron en 2023. El procedimiento sugerido es:</w:t>
       </w:r>
     </w:p>
     <w:p>
@@ -1413,7 +1581,7 @@
         </w:numPr>
       </w:pPr>
       <w:r>
-        <w:t xml:space="preserve">incorrecto, porque se debe multiplicar 0.05 por el número de atletas participantes</w:t>
+        <w:t xml:space="preserve">correcto, pero solo si se redondea al número entero más cercano de competidores</w:t>
       </w:r>
     </w:p>
     <w:p>
@@ -1424,7 +1592,7 @@
         </w:numPr>
       </w:pPr>
       <w:r>
-        <w:t xml:space="preserve">correcto, solamente si el resultado obtenido es un número exacto de atletas en remo</w:t>
+        <w:t xml:space="preserve">insuficiente, porque se debe calcular el promedio de atletas por país participante</w:t>
       </w:r>
     </w:p>
     <w:p>
@@ -1435,7 +1603,7 @@
         </w:numPr>
       </w:pPr>
       <w:r>
-        <w:t xml:space="preserve">insuficiente, porque falta multiplicar el resultado por el número de países participantes en 2021</w:t>
+        <w:t xml:space="preserve">insuficiente, porque falta considerar el número total de deportes en el evento</w:t>
       </w:r>
     </w:p>
     <w:p>
@@ -1446,7 +1614,7 @@
         </w:numPr>
       </w:pPr>
       <w:r>
-        <w:t xml:space="preserve">correcto, pero solo si se redondea al número entero más cercano de competidores</w:t>
+        <w:t xml:space="preserve">incorrecto, porque se debe multiplicar 0.09 por el número de atletas participantes</w:t>
       </w:r>
     </w:p>
     <w:p>
@@ -1467,7 +1635,7 @@
         <w:br/>
       </w:r>
       <w:r>
-        <w:t xml:space="preserve">Para resolver este problema, necesitamos evaluar si el procedimiento propuesto para calcular el número de atletas que compiten en remo es matemáticamente correcto.</w:t>
+        <w:t xml:space="preserve">Para resolver este problema, necesitamos evaluar si el procedimiento propuesto para calcular el número de atletas que compiten en atletismo es matemáticamente correcto.</w:t>
       </w:r>
     </w:p>
     <w:p>
@@ -1507,7 +1675,7 @@
         </w:numPr>
       </w:pPr>
       <w:r>
-        <w:t xml:space="preserve">Total de atletas en 2021: 6.906</w:t>
+        <w:t xml:space="preserve">Total de atletas en 2023: 7.872</w:t>
       </w:r>
     </w:p>
     <w:p>
@@ -1518,7 +1686,7 @@
         </w:numPr>
       </w:pPr>
       <w:r>
-        <w:t xml:space="preserve">Porcentaje que compite en remo: 5%</w:t>
+        <w:t xml:space="preserve">Porcentaje que compite en atletismo: 9%</w:t>
       </w:r>
     </w:p>
     <w:p>
@@ -1529,7 +1697,7 @@
         </w:numPr>
       </w:pPr>
       <w:r>
-        <w:t xml:space="preserve">Procedimiento sugerido: multiplicar 0.5 por 6.906</w:t>
+        <w:t xml:space="preserve">Procedimiento sugerido: multiplicar 0.9 por 7.872</w:t>
       </w:r>
     </w:p>
     <w:p>
@@ -1569,7 +1737,7 @@
         </w:numPr>
       </w:pPr>
       <w:r>
-        <w:t xml:space="preserve">El procedimiento propone multiplicar 0.5 por el total de atletas, pero esto es</w:t>
+        <w:t xml:space="preserve">El procedimiento propone multiplicar 0.9 por el total de atletas, pero esto es</w:t>
       </w:r>
       <w:r>
         <w:t xml:space="preserve"> </w:t>
@@ -1619,7 +1787,7 @@
         </w:numPr>
       </w:pPr>
       <w:r>
-        <w:t xml:space="preserve">5% = 0.05 (no 0.5)</w:t>
+        <w:t xml:space="preserve">9% = 0.09 (no 0.9)</w:t>
       </w:r>
     </w:p>
     <w:p>
@@ -1640,7 +1808,7 @@
         <w:t xml:space="preserve"> </w:t>
       </w:r>
       <w:r>
-        <w:t xml:space="preserve">5% de 6.906 = 0.05 × 6.906 = 345</w:t>
+        <w:t xml:space="preserve">9% de 7.872 = 0.09 × 7.872 = 708</w:t>
       </w:r>
     </w:p>
     <w:p>
@@ -1661,7 +1829,7 @@
         <w:t xml:space="preserve"> </w:t>
       </w:r>
       <w:r>
-        <w:t xml:space="preserve">0.5 × 6.906 = 3.453 (esto sería el 50%, no el 5%)</w:t>
+        <w:t xml:space="preserve">0.9 × 7.872 = 7.085 (esto sería el 90%, no el 9%)</w:t>
       </w:r>
     </w:p>
     <w:p>
@@ -1728,7 +1896,7 @@
         </w:numPr>
       </w:pPr>
       <w:r>
-        <w:t xml:space="preserve">El valor 0.5 corresponde al 50%, no al 5%</w:t>
+        <w:t xml:space="preserve">El valor 0.9 corresponde al 90%, no al 9%</w:t>
       </w:r>
     </w:p>
     <w:p>
@@ -1739,7 +1907,7 @@
         </w:numPr>
       </w:pPr>
       <w:r>
-        <w:t xml:space="preserve">Para calcular el 5% se debe usar 0.05, no 0.5</w:t>
+        <w:t xml:space="preserve">Para calcular el 9% se debe usar 0.09, no 0.9</w:t>
       </w:r>
     </w:p>
     <w:p>
@@ -1794,7 +1962,21 @@
           <w:b/>
           <w:bCs/>
         </w:rPr>
-        <w:t xml:space="preserve">“suficiente”</w:t>
+        <w:t xml:space="preserve">“</w:t>
+      </w:r>
+      <w:r>
+        <w:rPr>
+          <w:b/>
+          <w:bCs/>
+        </w:rPr>
+        <w:t xml:space="preserve">suficiente</w:t>
+      </w:r>
+      <w:r>
+        <w:rPr>
+          <w:b/>
+          <w:bCs/>
+        </w:rPr>
+        <w:t xml:space="preserve">”</w:t>
       </w:r>
       <w:r>
         <w:t xml:space="preserve">:</w:t>
@@ -1832,7 +2014,21 @@
           <w:b/>
           <w:bCs/>
         </w:rPr>
-        <w:t xml:space="preserve">“insuficiente”</w:t>
+        <w:t xml:space="preserve">“</w:t>
+      </w:r>
+      <w:r>
+        <w:rPr>
+          <w:b/>
+          <w:bCs/>
+        </w:rPr>
+        <w:t xml:space="preserve">insuficiente</w:t>
+      </w:r>
+      <w:r>
+        <w:rPr>
+          <w:b/>
+          <w:bCs/>
+        </w:rPr>
+        <w:t xml:space="preserve">”</w:t>
       </w:r>
       <w:r>
         <w:t xml:space="preserve">:</w:t>
@@ -1870,7 +2066,21 @@
           <w:b/>
           <w:bCs/>
         </w:rPr>
-        <w:t xml:space="preserve">“números exactos”</w:t>
+        <w:t xml:space="preserve">“</w:t>
+      </w:r>
+      <w:r>
+        <w:rPr>
+          <w:b/>
+          <w:bCs/>
+        </w:rPr>
+        <w:t xml:space="preserve">números exactos</w:t>
+      </w:r>
+      <w:r>
+        <w:rPr>
+          <w:b/>
+          <w:bCs/>
+        </w:rPr>
+        <w:t xml:space="preserve">”</w:t>
       </w:r>
       <w:r>
         <w:t xml:space="preserve">:</w:t>
@@ -1920,7 +2130,7 @@
         <w:t xml:space="preserve"> </w:t>
       </w:r>
       <w:r>
-        <w:t xml:space="preserve">porque usa 0.5 en lugar de 0.05. La respuesta correcta identifica este error y proporciona el valor decimal correcto que debe usarse.</w:t>
+        <w:t xml:space="preserve">porque usa 0.9 en lugar de 0.09. La respuesta correcta identifica este error y proporciona el valor decimal correcto que debe usarse.</w:t>
       </w:r>
     </w:p>
     <w:p>
@@ -1931,40 +2141,40 @@
         </w:numPr>
       </w:pPr>
       <w:r>
+        <w:t xml:space="preserve">Falso</w:t>
+      </w:r>
+    </w:p>
+    <w:p>
+      <w:pPr>
+        <w:numPr>
+          <w:ilvl w:val="1"/>
+          <w:numId w:val="1019"/>
+        </w:numPr>
+      </w:pPr>
+      <w:r>
+        <w:t xml:space="preserve">Falso</w:t>
+      </w:r>
+    </w:p>
+    <w:p>
+      <w:pPr>
+        <w:numPr>
+          <w:ilvl w:val="1"/>
+          <w:numId w:val="1019"/>
+        </w:numPr>
+      </w:pPr>
+      <w:r>
+        <w:t xml:space="preserve">Falso</w:t>
+      </w:r>
+    </w:p>
+    <w:p>
+      <w:pPr>
+        <w:numPr>
+          <w:ilvl w:val="1"/>
+          <w:numId w:val="1019"/>
+        </w:numPr>
+      </w:pPr>
+      <w:r>
         <w:t xml:space="preserve">Verdadero</w:t>
-      </w:r>
-    </w:p>
-    <w:p>
-      <w:pPr>
-        <w:numPr>
-          <w:ilvl w:val="1"/>
-          <w:numId w:val="1019"/>
-        </w:numPr>
-      </w:pPr>
-      <w:r>
-        <w:t xml:space="preserve">Falso</w:t>
-      </w:r>
-    </w:p>
-    <w:p>
-      <w:pPr>
-        <w:numPr>
-          <w:ilvl w:val="1"/>
-          <w:numId w:val="1019"/>
-        </w:numPr>
-      </w:pPr>
-      <w:r>
-        <w:t xml:space="preserve">Falso</w:t>
-      </w:r>
-    </w:p>
-    <w:p>
-      <w:pPr>
-        <w:numPr>
-          <w:ilvl w:val="1"/>
-          <w:numId w:val="1019"/>
-        </w:numPr>
-      </w:pPr>
-      <w:r>
-        <w:t xml:space="preserve">Falso</w:t>
       </w:r>
     </w:p>
     <w:p>
@@ -2046,7 +2256,7 @@
         </w:numPr>
       </w:pPr>
       <w:r>
-        <w:t xml:space="preserve">Del total de atletas participantes en 2019, el 6% compite en atletismo. Para determinar el número de atletas de atletismo ese año, se sugiere multiplicar 0.6 por el número de atletas que participaron en 2019. El procedimiento sugerido es:</w:t>
+        <w:t xml:space="preserve">Del total de atletas participantes en 2014, el 6% compite en boxeo. Para determinar el número de atletas de boxeo ese año, se sugiere multiplicar 0.6 por el número de atletas que participaron en 2014. El procedimiento sugerido es:</w:t>
       </w:r>
     </w:p>
     <w:p>
@@ -2057,6 +2267,17 @@
         </w:numPr>
       </w:pPr>
       <w:r>
+        <w:t xml:space="preserve">incorrecto, ya que 0.6 corresponde al 60% no al 6%</w:t>
+      </w:r>
+    </w:p>
+    <w:p>
+      <w:pPr>
+        <w:numPr>
+          <w:ilvl w:val="1"/>
+          <w:numId w:val="1020"/>
+        </w:numPr>
+      </w:pPr>
+      <w:r>
         <w:t xml:space="preserve">incorrecto, porque se debe multiplicar 0.06 por el número de atletas participantes</w:t>
       </w:r>
     </w:p>
@@ -2068,7 +2289,7 @@
         </w:numPr>
       </w:pPr>
       <w:r>
-        <w:t xml:space="preserve">insuficiente, porque se debe dividir entre el número de deportes practicados en 2019</w:t>
+        <w:t xml:space="preserve">insuficiente, porque falta considerar el número total de deportes en el evento</w:t>
       </w:r>
     </w:p>
     <w:p>
@@ -2079,18 +2300,7 @@
         </w:numPr>
       </w:pPr>
       <w:r>
-        <w:t xml:space="preserve">correcto, solamente si el resultado obtenido es un número exacto de atletas en atletismo</w:t>
-      </w:r>
-    </w:p>
-    <w:p>
-      <w:pPr>
-        <w:numPr>
-          <w:ilvl w:val="1"/>
-          <w:numId w:val="1020"/>
-        </w:numPr>
-      </w:pPr>
-      <w:r>
-        <w:t xml:space="preserve">correcto, pero solo si se redondea al número entero más cercano de competidores</w:t>
+        <w:t xml:space="preserve">insuficiente, porque falta multiplicar el resultado por el número de países participantes en 2014</w:t>
       </w:r>
     </w:p>
     <w:p>
@@ -2111,7 +2321,7 @@
         <w:br/>
       </w:r>
       <w:r>
-        <w:t xml:space="preserve">Para resolver este problema, necesitamos evaluar si el procedimiento propuesto para calcular el número de atletas que compiten en atletismo es matemáticamente correcto.</w:t>
+        <w:t xml:space="preserve">Para resolver este problema, necesitamos evaluar si el procedimiento propuesto para calcular el número de atletas que compiten en boxeo es matemáticamente correcto.</w:t>
       </w:r>
     </w:p>
     <w:p>
@@ -2151,7 +2361,7 @@
         </w:numPr>
       </w:pPr>
       <w:r>
-        <w:t xml:space="preserve">Total de atletas en 2019: 5.687</w:t>
+        <w:t xml:space="preserve">Total de atletas en 2014: 5.340</w:t>
       </w:r>
     </w:p>
     <w:p>
@@ -2162,7 +2372,7 @@
         </w:numPr>
       </w:pPr>
       <w:r>
-        <w:t xml:space="preserve">Porcentaje que compite en atletismo: 6%</w:t>
+        <w:t xml:space="preserve">Porcentaje que compite en boxeo: 6%</w:t>
       </w:r>
     </w:p>
     <w:p>
@@ -2173,7 +2383,7 @@
         </w:numPr>
       </w:pPr>
       <w:r>
-        <w:t xml:space="preserve">Procedimiento sugerido: multiplicar 0.6 por 5.687</w:t>
+        <w:t xml:space="preserve">Procedimiento sugerido: multiplicar 0.6 por 5.340</w:t>
       </w:r>
     </w:p>
     <w:p>
@@ -2284,7 +2494,7 @@
         <w:t xml:space="preserve"> </w:t>
       </w:r>
       <w:r>
-        <w:t xml:space="preserve">6% de 5.687 = 0.06 × 5.687 = 341</w:t>
+        <w:t xml:space="preserve">6% de 5.340 = 0.06 × 5.340 = 320</w:t>
       </w:r>
     </w:p>
     <w:p>
@@ -2305,7 +2515,7 @@
         <w:t xml:space="preserve"> </w:t>
       </w:r>
       <w:r>
-        <w:t xml:space="preserve">0.6 × 5.687 = 3.412 (esto sería el 60%, no el 6%)</w:t>
+        <w:t xml:space="preserve">0.6 × 5.340 = 3.204 (esto sería el 60%, no el 6%)</w:t>
       </w:r>
     </w:p>
     <w:p>
@@ -2438,7 +2648,21 @@
           <w:b/>
           <w:bCs/>
         </w:rPr>
-        <w:t xml:space="preserve">“suficiente”</w:t>
+        <w:t xml:space="preserve">“</w:t>
+      </w:r>
+      <w:r>
+        <w:rPr>
+          <w:b/>
+          <w:bCs/>
+        </w:rPr>
+        <w:t xml:space="preserve">suficiente</w:t>
+      </w:r>
+      <w:r>
+        <w:rPr>
+          <w:b/>
+          <w:bCs/>
+        </w:rPr>
+        <w:t xml:space="preserve">”</w:t>
       </w:r>
       <w:r>
         <w:t xml:space="preserve">:</w:t>
@@ -2476,7 +2700,21 @@
           <w:b/>
           <w:bCs/>
         </w:rPr>
-        <w:t xml:space="preserve">“insuficiente”</w:t>
+        <w:t xml:space="preserve">“</w:t>
+      </w:r>
+      <w:r>
+        <w:rPr>
+          <w:b/>
+          <w:bCs/>
+        </w:rPr>
+        <w:t xml:space="preserve">insuficiente</w:t>
+      </w:r>
+      <w:r>
+        <w:rPr>
+          <w:b/>
+          <w:bCs/>
+        </w:rPr>
+        <w:t xml:space="preserve">”</w:t>
       </w:r>
       <w:r>
         <w:t xml:space="preserve">:</w:t>
@@ -2514,7 +2752,21 @@
           <w:b/>
           <w:bCs/>
         </w:rPr>
-        <w:t xml:space="preserve">“números exactos”</w:t>
+        <w:t xml:space="preserve">“</w:t>
+      </w:r>
+      <w:r>
+        <w:rPr>
+          <w:b/>
+          <w:bCs/>
+        </w:rPr>
+        <w:t xml:space="preserve">números exactos</w:t>
+      </w:r>
+      <w:r>
+        <w:rPr>
+          <w:b/>
+          <w:bCs/>
+        </w:rPr>
+        <w:t xml:space="preserve">”</w:t>
       </w:r>
       <w:r>
         <w:t xml:space="preserve">:</w:t>
@@ -2575,6 +2827,17 @@
         </w:numPr>
       </w:pPr>
       <w:r>
+        <w:t xml:space="preserve">Falso</w:t>
+      </w:r>
+    </w:p>
+    <w:p>
+      <w:pPr>
+        <w:numPr>
+          <w:ilvl w:val="1"/>
+          <w:numId w:val="1025"/>
+        </w:numPr>
+      </w:pPr>
+      <w:r>
         <w:t xml:space="preserve">Verdadero</w:t>
       </w:r>
     </w:p>
@@ -2603,17 +2866,6 @@
     <w:p>
       <w:pPr>
         <w:numPr>
-          <w:ilvl w:val="1"/>
-          <w:numId w:val="1025"/>
-        </w:numPr>
-      </w:pPr>
-      <w:r>
-        <w:t xml:space="preserve">Falso</w:t>
-      </w:r>
-    </w:p>
-    <w:p>
-      <w:pPr>
-        <w:numPr>
           <w:ilvl w:val="0"/>
           <w:numId w:val="1001"/>
         </w:numPr>
@@ -2629,7 +2881,7 @@
         <w:br/>
       </w:r>
       <w:r>
-        <w:t xml:space="preserve">los Juegos Africanos se realizan cada cuatro años con la participación de países de África, alternando las sedes deportivas. La tabla muestra algunos datos de las últimas cinco versiones de los Juegos Africanos:</w:t>
+        <w:t xml:space="preserve">los Juegos Panamericanos se realizan cada cuatro años con la participación de países de América, alternando las sedes deportivas. La tabla muestra algunos datos de las últimas cinco versiones de los Juegos Panamericanos:</w:t>
       </w:r>
     </w:p>
     <w:p>
@@ -2690,7 +2942,7 @@
         </w:numPr>
       </w:pPr>
       <w:r>
-        <w:t xml:space="preserve">Del total de atletas participantes en 2020, el 7% compite en natación. Para determinar el número de atletas de natación ese año, se sugiere multiplicar 0.7 por el número de atletas que participaron en 2020. El procedimiento sugerido es:</w:t>
+        <w:t xml:space="preserve">Del total de atletas participantes en 2024, el 6% compite en boxeo. Para determinar el número de atletas de boxeo ese año, se sugiere multiplicar 0.6 por el número de atletas que participaron en 2024. El procedimiento sugerido es:</w:t>
       </w:r>
     </w:p>
     <w:p>
@@ -2701,7 +2953,7 @@
         </w:numPr>
       </w:pPr>
       <w:r>
-        <w:t xml:space="preserve">insuficiente, porque falta multiplicar el resultado por el número de países participantes en 2020</w:t>
+        <w:t xml:space="preserve">correcto, solamente si el resultado obtenido es un número exacto de atletas en boxeo</w:t>
       </w:r>
     </w:p>
     <w:p>
@@ -2712,7 +2964,7 @@
         </w:numPr>
       </w:pPr>
       <w:r>
-        <w:t xml:space="preserve">insuficiente, porque se debe dividir entre el número de deportes practicados en 2020</w:t>
+        <w:t xml:space="preserve">correcto, pero solo si se redondea al número entero más cercano de competidores</w:t>
       </w:r>
     </w:p>
     <w:p>
@@ -2723,7 +2975,7 @@
         </w:numPr>
       </w:pPr>
       <w:r>
-        <w:t xml:space="preserve">incorrecto, porque se debe multiplicar 0.07 por el número de atletas participantes</w:t>
+        <w:t xml:space="preserve">suficiente para determinar el número de atletas que participó en boxeo en el año 2024</w:t>
       </w:r>
     </w:p>
     <w:p>
@@ -2734,7 +2986,7 @@
         </w:numPr>
       </w:pPr>
       <w:r>
-        <w:t xml:space="preserve">insuficiente, porque falta considerar el número total de deportes en el evento</w:t>
+        <w:t xml:space="preserve">incorrecto, porque se debe multiplicar 0.06 por el número de atletas participantes</w:t>
       </w:r>
     </w:p>
     <w:p>
@@ -2755,7 +3007,7 @@
         <w:br/>
       </w:r>
       <w:r>
-        <w:t xml:space="preserve">Para resolver este problema, necesitamos evaluar si el procedimiento propuesto para calcular el número de atletas que compiten en natación es matemáticamente correcto.</w:t>
+        <w:t xml:space="preserve">Para resolver este problema, necesitamos evaluar si el procedimiento propuesto para calcular el número de atletas que compiten en boxeo es matemáticamente correcto.</w:t>
       </w:r>
     </w:p>
     <w:p>
@@ -2795,7 +3047,7 @@
         </w:numPr>
       </w:pPr>
       <w:r>
-        <w:t xml:space="preserve">Total de atletas en 2020: 6.464</w:t>
+        <w:t xml:space="preserve">Total de atletas en 2024: 5.890</w:t>
       </w:r>
     </w:p>
     <w:p>
@@ -2806,7 +3058,7 @@
         </w:numPr>
       </w:pPr>
       <w:r>
-        <w:t xml:space="preserve">Porcentaje que compite en natación: 7%</w:t>
+        <w:t xml:space="preserve">Porcentaje que compite en boxeo: 6%</w:t>
       </w:r>
     </w:p>
     <w:p>
@@ -2817,7 +3069,7 @@
         </w:numPr>
       </w:pPr>
       <w:r>
-        <w:t xml:space="preserve">Procedimiento sugerido: multiplicar 0.7 por 6.464</w:t>
+        <w:t xml:space="preserve">Procedimiento sugerido: multiplicar 0.6 por 5.890</w:t>
       </w:r>
     </w:p>
     <w:p>
@@ -2857,7 +3109,7 @@
         </w:numPr>
       </w:pPr>
       <w:r>
-        <w:t xml:space="preserve">El procedimiento propone multiplicar 0.7 por el total de atletas, pero esto es</w:t>
+        <w:t xml:space="preserve">El procedimiento propone multiplicar 0.6 por el total de atletas, pero esto es</w:t>
       </w:r>
       <w:r>
         <w:t xml:space="preserve"> </w:t>
@@ -2907,7 +3159,7 @@
         </w:numPr>
       </w:pPr>
       <w:r>
-        <w:t xml:space="preserve">7% = 0.07 (no 0.7)</w:t>
+        <w:t xml:space="preserve">6% = 0.06 (no 0.6)</w:t>
       </w:r>
     </w:p>
     <w:p>
@@ -2928,7 +3180,7 @@
         <w:t xml:space="preserve"> </w:t>
       </w:r>
       <w:r>
-        <w:t xml:space="preserve">7% de 6.464 = 0.07 × 6.464 = 452</w:t>
+        <w:t xml:space="preserve">6% de 5.890 = 0.06 × 5.890 = 353</w:t>
       </w:r>
     </w:p>
     <w:p>
@@ -2949,7 +3201,7 @@
         <w:t xml:space="preserve"> </w:t>
       </w:r>
       <w:r>
-        <w:t xml:space="preserve">0.7 × 6.464 = 4.525 (esto sería el 70%, no el 7%)</w:t>
+        <w:t xml:space="preserve">0.6 × 5.890 = 3.534 (esto sería el 60%, no el 6%)</w:t>
       </w:r>
     </w:p>
     <w:p>
@@ -3016,7 +3268,7 @@
         </w:numPr>
       </w:pPr>
       <w:r>
-        <w:t xml:space="preserve">El valor 0.7 corresponde al 70%, no al 7%</w:t>
+        <w:t xml:space="preserve">El valor 0.6 corresponde al 60%, no al 6%</w:t>
       </w:r>
     </w:p>
     <w:p>
@@ -3027,7 +3279,7 @@
         </w:numPr>
       </w:pPr>
       <w:r>
-        <w:t xml:space="preserve">Para calcular el 7% se debe usar 0.07, no 0.7</w:t>
+        <w:t xml:space="preserve">Para calcular el 6% se debe usar 0.06, no 0.6</w:t>
       </w:r>
     </w:p>
     <w:p>
@@ -3082,7 +3334,21 @@
           <w:b/>
           <w:bCs/>
         </w:rPr>
-        <w:t xml:space="preserve">“suficiente”</w:t>
+        <w:t xml:space="preserve">“</w:t>
+      </w:r>
+      <w:r>
+        <w:rPr>
+          <w:b/>
+          <w:bCs/>
+        </w:rPr>
+        <w:t xml:space="preserve">suficiente</w:t>
+      </w:r>
+      <w:r>
+        <w:rPr>
+          <w:b/>
+          <w:bCs/>
+        </w:rPr>
+        <w:t xml:space="preserve">”</w:t>
       </w:r>
       <w:r>
         <w:t xml:space="preserve">:</w:t>
@@ -3120,7 +3386,21 @@
           <w:b/>
           <w:bCs/>
         </w:rPr>
-        <w:t xml:space="preserve">“insuficiente”</w:t>
+        <w:t xml:space="preserve">“</w:t>
+      </w:r>
+      <w:r>
+        <w:rPr>
+          <w:b/>
+          <w:bCs/>
+        </w:rPr>
+        <w:t xml:space="preserve">insuficiente</w:t>
+      </w:r>
+      <w:r>
+        <w:rPr>
+          <w:b/>
+          <w:bCs/>
+        </w:rPr>
+        <w:t xml:space="preserve">”</w:t>
       </w:r>
       <w:r>
         <w:t xml:space="preserve">:</w:t>
@@ -3158,7 +3438,21 @@
           <w:b/>
           <w:bCs/>
         </w:rPr>
-        <w:t xml:space="preserve">“números exactos”</w:t>
+        <w:t xml:space="preserve">“</w:t>
+      </w:r>
+      <w:r>
+        <w:rPr>
+          <w:b/>
+          <w:bCs/>
+        </w:rPr>
+        <w:t xml:space="preserve">números exactos</w:t>
+      </w:r>
+      <w:r>
+        <w:rPr>
+          <w:b/>
+          <w:bCs/>
+        </w:rPr>
+        <w:t xml:space="preserve">”</w:t>
       </w:r>
       <w:r>
         <w:t xml:space="preserve">:</w:t>
@@ -3208,7 +3502,7 @@
         <w:t xml:space="preserve"> </w:t>
       </w:r>
       <w:r>
-        <w:t xml:space="preserve">porque usa 0.7 en lugar de 0.07. La respuesta correcta identifica este error y proporciona el valor decimal correcto que debe usarse.</w:t>
+        <w:t xml:space="preserve">porque usa 0.6 en lugar de 0.06. La respuesta correcta identifica este error y proporciona el valor decimal correcto que debe usarse.</w:t>
       </w:r>
     </w:p>
     <w:p>
@@ -3241,18 +3535,18 @@
         </w:numPr>
       </w:pPr>
       <w:r>
+        <w:t xml:space="preserve">Falso</w:t>
+      </w:r>
+    </w:p>
+    <w:p>
+      <w:pPr>
+        <w:numPr>
+          <w:ilvl w:val="1"/>
+          <w:numId w:val="1031"/>
+        </w:numPr>
+      </w:pPr>
+      <w:r>
         <w:t xml:space="preserve">Verdadero</w:t>
-      </w:r>
-    </w:p>
-    <w:p>
-      <w:pPr>
-        <w:numPr>
-          <w:ilvl w:val="1"/>
-          <w:numId w:val="1031"/>
-        </w:numPr>
-      </w:pPr>
-      <w:r>
-        <w:t xml:space="preserve">Falso</w:t>
       </w:r>
     </w:p>
     <w:bookmarkEnd w:id="55"/>
@@ -3294,7 +3588,7 @@
       <w:lvlText w:val=" "/>
       <w:lvlJc w:val="left"/>
       <w:pPr>
-        <w:ind w:left="720" w:hanging="360"/>
+        <w:ind w:left="720" w:hanging="480"/>
       </w:pPr>
     </w:lvl>
     <w:lvl w:ilvl="1">
@@ -3302,7 +3596,7 @@
       <w:lvlText w:val=" "/>
       <w:lvlJc w:val="left"/>
       <w:pPr>
-        <w:ind w:left="1440" w:hanging="360"/>
+        <w:ind w:left="1440" w:hanging="480"/>
       </w:pPr>
     </w:lvl>
     <w:lvl w:ilvl="2">
@@ -3310,7 +3604,7 @@
       <w:lvlText w:val=" "/>
       <w:lvlJc w:val="left"/>
       <w:pPr>
-        <w:ind w:left="2160" w:hanging="360"/>
+        <w:ind w:left="2160" w:hanging="480"/>
       </w:pPr>
     </w:lvl>
     <w:lvl w:ilvl="3">
@@ -3318,7 +3612,7 @@
       <w:lvlText w:val=" "/>
       <w:lvlJc w:val="left"/>
       <w:pPr>
-        <w:ind w:left="2880" w:hanging="360"/>
+        <w:ind w:left="2880" w:hanging="480"/>
       </w:pPr>
     </w:lvl>
     <w:lvl w:ilvl="4">
@@ -3326,7 +3620,7 @@
       <w:lvlText w:val=" "/>
       <w:lvlJc w:val="left"/>
       <w:pPr>
-        <w:ind w:left="3600" w:hanging="360"/>
+        <w:ind w:left="3600" w:hanging="480"/>
       </w:pPr>
     </w:lvl>
     <w:lvl w:ilvl="5">
@@ -3334,7 +3628,7 @@
       <w:lvlText w:val=" "/>
       <w:lvlJc w:val="left"/>
       <w:pPr>
-        <w:ind w:left="4320" w:hanging="360"/>
+        <w:ind w:left="4320" w:hanging="480"/>
       </w:pPr>
     </w:lvl>
     <w:lvl w:ilvl="6">
@@ -3342,7 +3636,7 @@
       <w:lvlText w:val=" "/>
       <w:lvlJc w:val="left"/>
       <w:pPr>
-        <w:ind w:left="5040" w:hanging="360"/>
+        <w:ind w:left="5040" w:hanging="480"/>
       </w:pPr>
     </w:lvl>
     <w:lvl w:ilvl="7">
@@ -3350,7 +3644,7 @@
       <w:lvlText w:val=" "/>
       <w:lvlJc w:val="left"/>
       <w:pPr>
-        <w:ind w:left="5760" w:hanging="360"/>
+        <w:ind w:left="5760" w:hanging="480"/>
       </w:pPr>
     </w:lvl>
     <w:lvl w:ilvl="8">
@@ -3358,7 +3652,7 @@
       <w:lvlText w:val=" "/>
       <w:lvlJc w:val="left"/>
       <w:pPr>
-        <w:ind w:left="6480" w:hanging="360"/>
+        <w:ind w:left="6480" w:hanging="480"/>
       </w:pPr>
     </w:lvl>
   </w:abstractNum>
@@ -3371,7 +3665,7 @@
       <w:lvlText w:val="%1."/>
       <w:lvlJc w:val="left"/>
       <w:pPr>
-        <w:ind w:left="720" w:hanging="360"/>
+        <w:ind w:left="720" w:hanging="480"/>
       </w:pPr>
     </w:lvl>
     <w:lvl w:ilvl="1">
@@ -3380,7 +3674,7 @@
       <w:lvlText w:val="%2."/>
       <w:lvlJc w:val="left"/>
       <w:pPr>
-        <w:ind w:left="1440" w:hanging="360"/>
+        <w:ind w:left="1440" w:hanging="480"/>
       </w:pPr>
     </w:lvl>
     <w:lvl w:ilvl="2">
@@ -3389,7 +3683,7 @@
       <w:lvlText w:val="%3."/>
       <w:lvlJc w:val="left"/>
       <w:pPr>
-        <w:ind w:left="2160" w:hanging="360"/>
+        <w:ind w:left="2160" w:hanging="480"/>
       </w:pPr>
     </w:lvl>
     <w:lvl w:ilvl="3">
@@ -3398,7 +3692,7 @@
       <w:lvlText w:val="%4."/>
       <w:lvlJc w:val="left"/>
       <w:pPr>
-        <w:ind w:left="2880" w:hanging="360"/>
+        <w:ind w:left="2880" w:hanging="480"/>
       </w:pPr>
     </w:lvl>
     <w:lvl w:ilvl="4">
@@ -3407,7 +3701,7 @@
       <w:lvlText w:val="%5."/>
       <w:lvlJc w:val="left"/>
       <w:pPr>
-        <w:ind w:left="3600" w:hanging="360"/>
+        <w:ind w:left="3600" w:hanging="480"/>
       </w:pPr>
     </w:lvl>
     <w:lvl w:ilvl="5">
@@ -3416,7 +3710,7 @@
       <w:lvlText w:val="%6."/>
       <w:lvlJc w:val="left"/>
       <w:pPr>
-        <w:ind w:left="4320" w:hanging="360"/>
+        <w:ind w:left="4320" w:hanging="480"/>
       </w:pPr>
     </w:lvl>
     <w:lvl w:ilvl="6">
@@ -3425,7 +3719,7 @@
       <w:lvlText w:val="%7."/>
       <w:lvlJc w:val="left"/>
       <w:pPr>
-        <w:ind w:left="5040" w:hanging="360"/>
+        <w:ind w:left="5040" w:hanging="480"/>
       </w:pPr>
     </w:lvl>
     <w:lvl w:ilvl="7">
@@ -3434,7 +3728,7 @@
       <w:lvlText w:val="%8."/>
       <w:lvlJc w:val="left"/>
       <w:pPr>
-        <w:ind w:left="5760" w:hanging="360"/>
+        <w:ind w:left="5760" w:hanging="480"/>
       </w:pPr>
     </w:lvl>
     <w:lvl w:ilvl="8">
@@ -3443,7 +3737,7 @@
       <w:lvlText w:val="%9."/>
       <w:lvlJc w:val="left"/>
       <w:pPr>
-        <w:ind w:left="6480" w:hanging="360"/>
+        <w:ind w:left="6480" w:hanging="480"/>
       </w:pPr>
     </w:lvl>
   </w:abstractNum>
@@ -3452,102 +3746,75 @@
     <w:multiLevelType w:val="multilevel"/>
     <w:lvl w:ilvl="0">
       <w:numFmt w:val="bullet"/>
-      <w:lvlText w:val=""/>
+      <w:lvlText w:val="•"/>
       <w:lvlJc w:val="left"/>
       <w:pPr>
-        <w:ind w:left="720" w:hanging="360"/>
-      </w:pPr>
-      <w:rPr>
-        <w:rFonts w:ascii="Symbol" w:hAnsi="Symbol" w:cs="Symbol" w:hint="default"/>
-      </w:rPr>
+        <w:ind w:left="720" w:hanging="480"/>
+      </w:pPr>
     </w:lvl>
     <w:lvl w:ilvl="1">
       <w:numFmt w:val="bullet"/>
-      <w:lvlText w:val="o"/>
+      <w:lvlText w:val="–"/>
       <w:lvlJc w:val="left"/>
       <w:pPr>
-        <w:ind w:left="1440" w:hanging="360"/>
-      </w:pPr>
-      <w:rPr>
-        <w:rFonts w:ascii="Courier New" w:hAnsi="Courier New" w:cs="Courier New" w:hint="default"/>
-      </w:rPr>
+        <w:ind w:left="1440" w:hanging="480"/>
+      </w:pPr>
     </w:lvl>
     <w:lvl w:ilvl="2">
       <w:numFmt w:val="bullet"/>
-      <w:lvlText w:val=""/>
+      <w:lvlText w:val="•"/>
       <w:lvlJc w:val="left"/>
       <w:pPr>
-        <w:ind w:left="2160" w:hanging="360"/>
-      </w:pPr>
-      <w:rPr>
-        <w:rFonts w:ascii="Wingdings" w:hAnsi="Wingdings" w:cs="Wingdings" w:hint="default"/>
-      </w:rPr>
+        <w:ind w:left="2160" w:hanging="480"/>
+      </w:pPr>
     </w:lvl>
     <w:lvl w:ilvl="3">
       <w:numFmt w:val="bullet"/>
-      <w:lvlText w:val=""/>
+      <w:lvlText w:val="–"/>
       <w:lvlJc w:val="left"/>
       <w:pPr>
-        <w:ind w:left="2880" w:hanging="360"/>
-      </w:pPr>
-      <w:rPr>
-        <w:rFonts w:ascii="Symbol" w:hAnsi="Symbol" w:cs="Symbol" w:hint="default"/>
-      </w:rPr>
+        <w:ind w:left="2880" w:hanging="480"/>
+      </w:pPr>
     </w:lvl>
     <w:lvl w:ilvl="4">
       <w:numFmt w:val="bullet"/>
-      <w:lvlText w:val="o"/>
+      <w:lvlText w:val="•"/>
       <w:lvlJc w:val="left"/>
       <w:pPr>
-        <w:ind w:left="3600" w:hanging="360"/>
-      </w:pPr>
-      <w:rPr>
-        <w:rFonts w:ascii="Courier New" w:hAnsi="Courier New" w:cs="Courier New" w:hint="default"/>
-      </w:rPr>
+        <w:ind w:left="3600" w:hanging="480"/>
+      </w:pPr>
     </w:lvl>
     <w:lvl w:ilvl="5">
       <w:numFmt w:val="bullet"/>
-      <w:lvlText w:val=""/>
+      <w:lvlText w:val="–"/>
       <w:lvlJc w:val="left"/>
       <w:pPr>
-        <w:ind w:left="4320" w:hanging="360"/>
-      </w:pPr>
-      <w:rPr>
-        <w:rFonts w:ascii="Wingdings" w:hAnsi="Wingdings" w:cs="Wingdings" w:hint="default"/>
-      </w:rPr>
+        <w:ind w:left="4320" w:hanging="480"/>
+      </w:pPr>
     </w:lvl>
     <w:lvl w:ilvl="6">
       <w:numFmt w:val="bullet"/>
-      <w:lvlText w:val=""/>
+      <w:lvlText w:val="•"/>
       <w:lvlJc w:val="left"/>
       <w:pPr>
-        <w:ind w:left="5040" w:hanging="360"/>
-      </w:pPr>
-      <w:rPr>
-        <w:rFonts w:ascii="Symbol" w:hAnsi="Symbol" w:cs="Symbol" w:hint="default"/>
-      </w:rPr>
+        <w:ind w:left="5040" w:hanging="480"/>
+      </w:pPr>
     </w:lvl>
     <w:lvl w:ilvl="7">
       <w:numFmt w:val="bullet"/>
-      <w:lvlText w:val="o"/>
+      <w:lvlText w:val="–"/>
       <w:lvlJc w:val="left"/>
       <w:pPr>
-        <w:ind w:left="5760" w:hanging="360"/>
-      </w:pPr>
-      <w:rPr>
-        <w:rFonts w:ascii="Courier New" w:hAnsi="Courier New" w:cs="Courier New" w:hint="default"/>
-      </w:rPr>
+        <w:ind w:left="5760" w:hanging="480"/>
+      </w:pPr>
     </w:lvl>
     <w:lvl w:ilvl="8">
       <w:numFmt w:val="bullet"/>
-      <w:lvlText w:val=""/>
+      <w:lvlText w:val="•"/>
       <w:lvlJc w:val="left"/>
       <w:pPr>
-        <w:ind w:left="6480" w:hanging="360"/>
-      </w:pPr>
-      <w:rPr>
-        <w:rFonts w:ascii="Wingdings" w:hAnsi="Wingdings" w:cs="Wingdings" w:hint="default"/>
-      </w:rPr>
+        <w:ind w:left="6480" w:hanging="480"/>
+      </w:pPr>
     </w:lvl>
   </w:abstractNum>
   <w:num w:numId="1000">
@@ -4130,69 +4397,36 @@
     <w:name w:val="Title"/>
     <w:basedOn w:val="Normal"/>
     <w:next w:val="BodyText"/>
-    <w:link w:val="TitleChar"/>
-    <w:uiPriority w:val="10"/>
     <w:qFormat/>
-    <w:rsid w:val="00A10FD9"/>
     <w:pPr>
-      <w:spacing w:after="80" w:line="240" w:lineRule="auto"/>
-      <w:contextualSpacing/>
+      <w:keepNext/>
+      <w:keepLines/>
+      <w:spacing w:after="240" w:before="480"/>
       <w:jc w:val="center"/>
     </w:pPr>
     <w:rPr>
       <w:rFonts w:asciiTheme="majorHAnsi" w:cstheme="majorBidi" w:eastAsiaTheme="majorEastAsia" w:hAnsiTheme="majorHAnsi"/>
-      <w:spacing w:val="-10"/>
-      <w:kern w:val="28"/>
-      <w:sz w:val="56"/>
-      <w:szCs w:val="56"/>
-    </w:rPr>
-  </w:style>
-  <w:style w:customStyle="1" w:styleId="TitleChar" w:type="character">
-    <w:name w:val="Title Char"/>
-    <w:basedOn w:val="DefaultParagraphFont"/>
-    <w:link w:val="Title"/>
-    <w:uiPriority w:val="10"/>
-    <w:rsid w:val="00A10FD9"/>
-    <w:rPr>
-      <w:rFonts w:asciiTheme="majorHAnsi" w:cstheme="majorBidi" w:eastAsiaTheme="majorEastAsia" w:hAnsiTheme="majorHAnsi"/>
-      <w:spacing w:val="-10"/>
-      <w:kern w:val="28"/>
-      <w:sz w:val="56"/>
-      <w:szCs w:val="56"/>
+      <w:b/>
+      <w:bCs/>
+      <w:color w:themeColor="accent1" w:themeShade="B5" w:val="345A8A"/>
+      <w:sz w:val="36"/>
+      <w:szCs w:val="36"/>
     </w:rPr>
   </w:style>
   <w:style w:styleId="Subtitle" w:type="paragraph">
     <w:name w:val="Subtitle"/>
     <w:basedOn w:val="Title"/>
     <w:next w:val="BodyText"/>
-    <w:link w:val="SubtitleChar"/>
-    <w:uiPriority w:val="11"/>
     <w:qFormat/>
-    <w:rsid w:val="00A10FD9"/>
     <w:pPr>
-      <w:numPr>
-        <w:ilvl w:val="1"/>
-      </w:numPr>
+      <w:keepNext/>
+      <w:keepLines/>
+      <w:spacing w:after="240" w:before="240"/>
+      <w:jc w:val="center"/>
     </w:pPr>
     <w:rPr>
-      <w:rFonts w:cstheme="majorBidi" w:eastAsiaTheme="majorEastAsia"/>
-      <w:spacing w:val="15"/>
-      <w:sz w:val="28"/>
-      <w:szCs w:val="28"/>
-    </w:rPr>
-  </w:style>
-  <w:style w:customStyle="1" w:styleId="SubtitleChar" w:type="character">
-    <w:name w:val="Subtitle Char"/>
-    <w:basedOn w:val="DefaultParagraphFont"/>
-    <w:link w:val="Subtitle"/>
-    <w:uiPriority w:val="11"/>
-    <w:rsid w:val="00A10FD9"/>
-    <w:rPr>
-      <w:rFonts w:cstheme="majorBidi" w:eastAsiaTheme="majorEastAsia"/>
-      <w:color w:themeColor="text1" w:themeTint="A6" w:val="595959"/>
-      <w:spacing w:val="15"/>
-      <w:sz w:val="28"/>
-      <w:szCs w:val="28"/>
+      <w:sz w:val="30"/>
+      <w:szCs w:val="30"/>
     </w:rPr>
   </w:style>
   <w:style w:customStyle="1" w:styleId="Author" w:type="paragraph">
@@ -4228,6 +4462,7 @@
     </w:pPr>
     <w:rPr>
       <w:b/>
+      <w:color w:val="345A8A"/>
       <w:sz w:val="20"/>
       <w:szCs w:val="20"/>
     </w:rPr>
@@ -4256,321 +4491,191 @@
     <w:rPr/>
   </w:style>
   <w:style w:styleId="Heading1" w:type="paragraph">
-    <w:name w:val="heading 1"/>
+    <w:name w:val="Heading 1"/>
     <w:basedOn w:val="Normal"/>
     <w:next w:val="BodyText"/>
-    <w:link w:val="Heading1Char"/>
     <w:uiPriority w:val="9"/>
     <w:qFormat/>
-    <w:rsid w:val="00A10FD9"/>
     <w:pPr>
       <w:keepNext/>
       <w:keepLines/>
-      <w:spacing w:after="80" w:before="360"/>
+      <w:spacing w:after="0" w:before="480"/>
       <w:outlineLvl w:val="0"/>
     </w:pPr>
     <w:rPr>
       <w:rFonts w:asciiTheme="majorHAnsi" w:cstheme="majorBidi" w:eastAsiaTheme="majorEastAsia" w:hAnsiTheme="majorHAnsi"/>
-      <w:color w:themeColor="accent1" w:themeShade="BF" w:val="0F4761"/>
-      <w:sz w:val="40"/>
-      <w:szCs w:val="40"/>
+      <w:b/>
+      <w:bCs/>
+      <w:color w:themeColor="accent1" w:val="4F81BD"/>
+      <w:sz w:val="32"/>
+      <w:szCs w:val="32"/>
     </w:rPr>
   </w:style>
   <w:style w:styleId="Heading2" w:type="paragraph">
-    <w:name w:val="heading 2"/>
+    <w:name w:val="Heading 2"/>
     <w:basedOn w:val="Normal"/>
     <w:next w:val="BodyText"/>
-    <w:link w:val="Heading2Char"/>
     <w:uiPriority w:val="9"/>
-    <w:semiHidden/>
     <w:unhideWhenUsed/>
     <w:qFormat/>
-    <w:rsid w:val="00A10FD9"/>
     <w:pPr>
       <w:keepNext/>
       <w:keepLines/>
-      <w:spacing w:after="80" w:before="160"/>
+      <w:spacing w:after="0" w:before="200"/>
       <w:outlineLvl w:val="1"/>
     </w:pPr>
     <w:rPr>
       <w:rFonts w:asciiTheme="majorHAnsi" w:cstheme="majorBidi" w:eastAsiaTheme="majorEastAsia" w:hAnsiTheme="majorHAnsi"/>
-      <w:color w:themeColor="accent1" w:themeShade="BF" w:val="0F4761"/>
-      <w:sz w:val="32"/>
-      <w:szCs w:val="32"/>
+      <w:b/>
+      <w:bCs/>
+      <w:color w:themeColor="accent1" w:val="4F81BD"/>
+      <w:sz w:val="28"/>
+      <w:szCs w:val="28"/>
     </w:rPr>
   </w:style>
   <w:style w:styleId="Heading3" w:type="paragraph">
-    <w:name w:val="heading 3"/>
+    <w:name w:val="Heading 3"/>
     <w:basedOn w:val="Normal"/>
     <w:next w:val="BodyText"/>
-    <w:link w:val="Heading3Char"/>
     <w:uiPriority w:val="9"/>
-    <w:semiHidden/>
     <w:unhideWhenUsed/>
     <w:qFormat/>
-    <w:rsid w:val="00A10FD9"/>
     <w:pPr>
       <w:keepNext/>
       <w:keepLines/>
-      <w:spacing w:after="80" w:before="160"/>
+      <w:spacing w:after="0" w:before="200"/>
       <w:outlineLvl w:val="2"/>
     </w:pPr>
     <w:rPr>
-      <w:rFonts w:cstheme="majorBidi" w:eastAsiaTheme="majorEastAsia"/>
-      <w:color w:themeColor="accent1" w:themeShade="BF" w:val="0F4761"/>
-      <w:sz w:val="28"/>
-      <w:szCs w:val="28"/>
+      <w:rFonts w:asciiTheme="majorHAnsi" w:cstheme="majorBidi" w:eastAsiaTheme="majorEastAsia" w:hAnsiTheme="majorHAnsi"/>
+      <w:b/>
+      <w:bCs/>
+      <w:color w:themeColor="accent1" w:val="4F81BD"/>
+      <w:sz w:val="24"/>
+      <w:szCs w:val="24"/>
     </w:rPr>
   </w:style>
   <w:style w:styleId="Heading4" w:type="paragraph">
-    <w:name w:val="heading 4"/>
+    <w:name w:val="Heading 4"/>
     <w:basedOn w:val="Normal"/>
     <w:next w:val="BodyText"/>
-    <w:link w:val="Heading4Char"/>
     <w:uiPriority w:val="9"/>
-    <w:semiHidden/>
     <w:unhideWhenUsed/>
     <w:qFormat/>
-    <w:rsid w:val="00A10FD9"/>
     <w:pPr>
       <w:keepNext/>
       <w:keepLines/>
-      <w:spacing w:after="40" w:before="80"/>
+      <w:spacing w:after="0" w:before="200"/>
       <w:outlineLvl w:val="3"/>
     </w:pPr>
     <w:rPr>
-      <w:rFonts w:cstheme="majorBidi" w:eastAsiaTheme="majorEastAsia"/>
+      <w:rFonts w:asciiTheme="majorHAnsi" w:cstheme="majorBidi" w:eastAsiaTheme="majorEastAsia" w:hAnsiTheme="majorHAnsi"/>
+      <w:bCs/>
       <w:i/>
-      <w:iCs/>
-      <w:color w:themeColor="accent1" w:themeShade="BF" w:val="0F4761"/>
+      <w:color w:themeColor="accent1" w:val="4F81BD"/>
+      <w:sz w:val="24"/>
+      <w:szCs w:val="24"/>
     </w:rPr>
   </w:style>
   <w:style w:styleId="Heading5" w:type="paragraph">
-    <w:name w:val="heading 5"/>
+    <w:name w:val="Heading 5"/>
     <w:basedOn w:val="Normal"/>
     <w:next w:val="BodyText"/>
-    <w:link w:val="Heading5Char"/>
     <w:uiPriority w:val="9"/>
-    <w:semiHidden/>
     <w:unhideWhenUsed/>
     <w:qFormat/>
-    <w:rsid w:val="00A10FD9"/>
     <w:pPr>
       <w:keepNext/>
       <w:keepLines/>
-      <w:spacing w:after="40" w:before="80"/>
+      <w:spacing w:after="0" w:before="200"/>
       <w:outlineLvl w:val="4"/>
     </w:pPr>
     <w:rPr>
-      <w:rFonts w:cstheme="majorBidi" w:eastAsiaTheme="majorEastAsia"/>
-      <w:color w:themeColor="accent1" w:themeShade="BF" w:val="0F4761"/>
+      <w:rFonts w:asciiTheme="majorHAnsi" w:cstheme="majorBidi" w:eastAsiaTheme="majorEastAsia" w:hAnsiTheme="majorHAnsi"/>
+      <w:iCs/>
+      <w:color w:themeColor="accent1" w:val="4F81BD"/>
+      <w:sz w:val="24"/>
+      <w:szCs w:val="24"/>
     </w:rPr>
   </w:style>
   <w:style w:styleId="Heading6" w:type="paragraph">
-    <w:name w:val="heading 6"/>
+    <w:name w:val="Heading 6"/>
     <w:basedOn w:val="Normal"/>
     <w:next w:val="BodyText"/>
-    <w:link w:val="Heading6Char"/>
     <w:uiPriority w:val="9"/>
-    <w:semiHidden/>
     <w:unhideWhenUsed/>
     <w:qFormat/>
-    <w:rsid w:val="00A10FD9"/>
     <w:pPr>
       <w:keepNext/>
       <w:keepLines/>
-      <w:spacing w:after="0" w:before="40"/>
+      <w:spacing w:after="0" w:before="200"/>
       <w:outlineLvl w:val="5"/>
     </w:pPr>
     <w:rPr>
-      <w:rFonts w:cstheme="majorBidi" w:eastAsiaTheme="majorEastAsia"/>
-      <w:i/>
-      <w:iCs/>
-      <w:color w:themeColor="text1" w:themeTint="A6" w:val="595959"/>
+      <w:rFonts w:asciiTheme="majorHAnsi" w:cstheme="majorBidi" w:eastAsiaTheme="majorEastAsia" w:hAnsiTheme="majorHAnsi"/>
+      <w:color w:themeColor="accent1" w:val="4F81BD"/>
+      <w:sz w:val="24"/>
+      <w:szCs w:val="24"/>
     </w:rPr>
   </w:style>
   <w:style w:styleId="Heading7" w:type="paragraph">
-    <w:name w:val="heading 7"/>
+    <w:name w:val="Heading 7"/>
     <w:basedOn w:val="Normal"/>
     <w:next w:val="BodyText"/>
-    <w:link w:val="Heading7Char"/>
     <w:uiPriority w:val="9"/>
-    <w:semiHidden/>
     <w:unhideWhenUsed/>
     <w:qFormat/>
-    <w:rsid w:val="00A10FD9"/>
     <w:pPr>
       <w:keepNext/>
       <w:keepLines/>
-      <w:spacing w:after="0" w:before="40"/>
+      <w:spacing w:after="0" w:before="200"/>
       <w:outlineLvl w:val="6"/>
     </w:pPr>
     <w:rPr>
-      <w:rFonts w:cstheme="majorBidi" w:eastAsiaTheme="majorEastAsia"/>
-      <w:color w:themeColor="text1" w:themeTint="A6" w:val="595959"/>
+      <w:rFonts w:asciiTheme="majorHAnsi" w:cstheme="majorBidi" w:eastAsiaTheme="majorEastAsia" w:hAnsiTheme="majorHAnsi"/>
+      <w:color w:themeColor="accent1" w:val="4F81BD"/>
+      <w:sz w:val="24"/>
+      <w:szCs w:val="24"/>
     </w:rPr>
   </w:style>
   <w:style w:styleId="Heading8" w:type="paragraph">
-    <w:name w:val="heading 8"/>
+    <w:name w:val="Heading 8"/>
     <w:basedOn w:val="Normal"/>
     <w:next w:val="BodyText"/>
-    <w:link w:val="Heading8Char"/>
     <w:uiPriority w:val="9"/>
-    <w:semiHidden/>
     <w:unhideWhenUsed/>
     <w:qFormat/>
-    <w:rsid w:val="00A10FD9"/>
     <w:pPr>
       <w:keepNext/>
       <w:keepLines/>
-      <w:spacing w:after="0"/>
+      <w:spacing w:after="0" w:before="200"/>
       <w:outlineLvl w:val="7"/>
     </w:pPr>
     <w:rPr>
-      <w:rFonts w:cstheme="majorBidi" w:eastAsiaTheme="majorEastAsia"/>
-      <w:i/>
-      <w:iCs/>
-      <w:color w:themeColor="text1" w:themeTint="D8" w:val="272727"/>
+      <w:rFonts w:asciiTheme="majorHAnsi" w:cstheme="majorBidi" w:eastAsiaTheme="majorEastAsia" w:hAnsiTheme="majorHAnsi"/>
+      <w:color w:themeColor="accent1" w:val="4F81BD"/>
+      <w:sz w:val="24"/>
+      <w:szCs w:val="24"/>
     </w:rPr>
   </w:style>
   <w:style w:styleId="Heading9" w:type="paragraph">
-    <w:name w:val="heading 9"/>
+    <w:name w:val="Heading 9"/>
     <w:basedOn w:val="Normal"/>
     <w:next w:val="BodyText"/>
-    <w:link w:val="Heading9Char"/>
     <w:uiPriority w:val="9"/>
-    <w:semiHidden/>
     <w:unhideWhenUsed/>
     <w:qFormat/>
-    <w:rsid w:val="00A10FD9"/>
     <w:pPr>
       <w:keepNext/>
       <w:keepLines/>
-      <w:spacing w:after="0"/>
+      <w:spacing w:after="0" w:before="200"/>
       <w:outlineLvl w:val="8"/>
     </w:pPr>
     <w:rPr>
-      <w:rFonts w:cstheme="majorBidi" w:eastAsiaTheme="majorEastAsia"/>
-      <w:color w:themeColor="text1" w:themeTint="D8" w:val="272727"/>
-    </w:rPr>
-  </w:style>
-  <w:style w:customStyle="1" w:styleId="Heading1Char" w:type="character">
-    <w:name w:val="Heading 1 Char"/>
-    <w:basedOn w:val="DefaultParagraphFont"/>
-    <w:link w:val="Heading1"/>
-    <w:uiPriority w:val="9"/>
-    <w:rsid w:val="00A10FD9"/>
-    <w:rPr>
       <w:rFonts w:asciiTheme="majorHAnsi" w:cstheme="majorBidi" w:eastAsiaTheme="majorEastAsia" w:hAnsiTheme="majorHAnsi"/>
-      <w:color w:themeColor="accent1" w:themeShade="BF" w:val="0F4761"/>
-      <w:sz w:val="40"/>
-      <w:szCs w:val="40"/>
-    </w:rPr>
-  </w:style>
-  <w:style w:customStyle="1" w:styleId="Heading2Char" w:type="character">
-    <w:name w:val="Heading 2 Char"/>
-    <w:basedOn w:val="DefaultParagraphFont"/>
-    <w:link w:val="Heading2"/>
-    <w:uiPriority w:val="9"/>
-    <w:semiHidden/>
-    <w:rsid w:val="00A10FD9"/>
-    <w:rPr>
-      <w:rFonts w:asciiTheme="majorHAnsi" w:cstheme="majorBidi" w:eastAsiaTheme="majorEastAsia" w:hAnsiTheme="majorHAnsi"/>
-      <w:color w:themeColor="accent1" w:themeShade="BF" w:val="0F4761"/>
-      <w:sz w:val="32"/>
-      <w:szCs w:val="32"/>
-    </w:rPr>
-  </w:style>
-  <w:style w:customStyle="1" w:styleId="Heading3Char" w:type="character">
-    <w:name w:val="Heading 3 Char"/>
-    <w:basedOn w:val="DefaultParagraphFont"/>
-    <w:link w:val="Heading3"/>
-    <w:uiPriority w:val="9"/>
-    <w:semiHidden/>
-    <w:rsid w:val="00A10FD9"/>
-    <w:rPr>
-      <w:rFonts w:cstheme="majorBidi" w:eastAsiaTheme="majorEastAsia"/>
-      <w:color w:themeColor="accent1" w:themeShade="BF" w:val="0F4761"/>
-      <w:sz w:val="28"/>
-      <w:szCs w:val="28"/>
-    </w:rPr>
-  </w:style>
-  <w:style w:customStyle="1" w:styleId="Heading4Char" w:type="character">
-    <w:name w:val="Heading 4 Char"/>
-    <w:basedOn w:val="DefaultParagraphFont"/>
-    <w:link w:val="Heading4"/>
-    <w:uiPriority w:val="9"/>
-    <w:semiHidden/>
-    <w:rsid w:val="00A10FD9"/>
-    <w:rPr>
-      <w:rFonts w:cstheme="majorBidi" w:eastAsiaTheme="majorEastAsia"/>
-      <w:i/>
-      <w:iCs/>
-      <w:color w:themeColor="accent1" w:themeShade="BF" w:val="0F4761"/>
-    </w:rPr>
-  </w:style>
-  <w:style w:customStyle="1" w:styleId="Heading5Char" w:type="character">
-    <w:name w:val="Heading 5 Char"/>
-    <w:basedOn w:val="DefaultParagraphFont"/>
-    <w:link w:val="Heading5"/>
-    <w:uiPriority w:val="9"/>
-    <w:semiHidden/>
-    <w:rsid w:val="00A10FD9"/>
-    <w:rPr>
-      <w:rFonts w:cstheme="majorBidi" w:eastAsiaTheme="majorEastAsia"/>
-      <w:color w:themeColor="accent1" w:themeShade="BF" w:val="0F4761"/>
-    </w:rPr>
-  </w:style>
-  <w:style w:customStyle="1" w:styleId="Heading6Char" w:type="character">
-    <w:name w:val="Heading 6 Char"/>
-    <w:basedOn w:val="DefaultParagraphFont"/>
-    <w:link w:val="Heading6"/>
-    <w:uiPriority w:val="9"/>
-    <w:semiHidden/>
-    <w:rsid w:val="00A10FD9"/>
-    <w:rPr>
-      <w:rFonts w:cstheme="majorBidi" w:eastAsiaTheme="majorEastAsia"/>
-      <w:i/>
-      <w:iCs/>
-      <w:color w:themeColor="text1" w:themeTint="A6" w:val="595959"/>
-    </w:rPr>
-  </w:style>
-  <w:style w:customStyle="1" w:styleId="Heading7Char" w:type="character">
-    <w:name w:val="Heading 7 Char"/>
-    <w:basedOn w:val="DefaultParagraphFont"/>
-    <w:link w:val="Heading7"/>
-    <w:uiPriority w:val="9"/>
-    <w:semiHidden/>
-    <w:rsid w:val="00A10FD9"/>
-    <w:rPr>
-      <w:rFonts w:cstheme="majorBidi" w:eastAsiaTheme="majorEastAsia"/>
-      <w:color w:themeColor="text1" w:themeTint="A6" w:val="595959"/>
-    </w:rPr>
-  </w:style>
-  <w:style w:customStyle="1" w:styleId="Heading8Char" w:type="character">
-    <w:name w:val="Heading 8 Char"/>
-    <w:basedOn w:val="DefaultParagraphFont"/>
-    <w:link w:val="Heading8"/>
-    <w:uiPriority w:val="9"/>
-    <w:semiHidden/>
-    <w:rsid w:val="00A10FD9"/>
-    <w:rPr>
-      <w:rFonts w:cstheme="majorBidi" w:eastAsiaTheme="majorEastAsia"/>
-      <w:i/>
-      <w:iCs/>
-      <w:color w:themeColor="text1" w:themeTint="D8" w:val="272727"/>
-    </w:rPr>
-  </w:style>
-  <w:style w:customStyle="1" w:styleId="Heading9Char" w:type="character">
-    <w:name w:val="Heading 9 Char"/>
-    <w:basedOn w:val="DefaultParagraphFont"/>
-    <w:link w:val="Heading9"/>
-    <w:uiPriority w:val="9"/>
-    <w:semiHidden/>
-    <w:rsid w:val="00A10FD9"/>
-    <w:rPr>
-      <w:rFonts w:cstheme="majorBidi" w:eastAsiaTheme="majorEastAsia"/>
-      <w:color w:themeColor="text1" w:themeTint="D8" w:val="272727"/>
+      <w:color w:themeColor="accent1" w:val="4F81BD"/>
+      <w:sz w:val="24"/>
+      <w:szCs w:val="24"/>
     </w:rPr>
   </w:style>
   <w:style w:styleId="BlockText" w:type="paragraph">
@@ -4595,8 +4700,8 @@
   </w:style>
   <w:style w:styleId="FootnoteBlockText" w:type="paragraph">
     <w:name w:val="Footnote Block Text"/>
-    <w:basedOn w:val="FootnoteText"/>
-    <w:next w:val="FootnoteText"/>
+    <w:basedOn w:val="Footnote Text"/>
+    <w:next w:val="Footnote Text"/>
     <w:uiPriority w:val="9"/>
     <w:unhideWhenUsed/>
     <w:qFormat/>
@@ -4988,44 +5093,44 @@
         <a:sysClr val="window" lastClr="FFFFFF"/>
       </a:lt1>
       <a:dk2>
-        <a:srgbClr val="0E2841"/>
+        <a:srgbClr val="1F497D"/>
       </a:dk2>
       <a:lt2>
-        <a:srgbClr val="E8E8E8"/>
+        <a:srgbClr val="EEECE1"/>
       </a:lt2>
       <a:accent1>
-        <a:srgbClr val="156082"/>
+        <a:srgbClr val="4F81BD"/>
       </a:accent1>
       <a:accent2>
-        <a:srgbClr val="E97132"/>
+        <a:srgbClr val="C0504D"/>
       </a:accent2>
       <a:accent3>
-        <a:srgbClr val="196B24"/>
+        <a:srgbClr val="9BBB59"/>
       </a:accent3>
       <a:accent4>
-        <a:srgbClr val="0F9ED5"/>
+        <a:srgbClr val="8064A2"/>
       </a:accent4>
       <a:accent5>
-        <a:srgbClr val="A02B93"/>
+        <a:srgbClr val="4BACC6"/>
       </a:accent5>
       <a:accent6>
-        <a:srgbClr val="4EA72E"/>
+        <a:srgbClr val="F79646"/>
       </a:accent6>
       <a:hlink>
-        <a:srgbClr val="467886"/>
+        <a:srgbClr val="0000FF"/>
       </a:hlink>
       <a:folHlink>
-        <a:srgbClr val="96607D"/>
+        <a:srgbClr val="800080"/>
       </a:folHlink>
     </a:clrScheme>
     <a:fontScheme name="Office">
       <a:majorFont>
-        <a:latin typeface="Aptos Display" panose="02110004020202020204"/>
+        <a:latin typeface="Calibri"/>
         <a:ea typeface=""/>
         <a:cs typeface=""/>
-        <a:font script="Jpan" typeface="游ゴシック Light"/>
+        <a:font script="Jpan" typeface="ＭＳ ゴシック"/>
         <a:font script="Hang" typeface="맑은 고딕"/>
-        <a:font script="Hans" typeface="等线 Light"/>
+        <a:font script="Hans" typeface="宋体"/>
         <a:font script="Hant" typeface="新細明體"/>
         <a:font script="Arab" typeface="Times New Roman"/>
         <a:font script="Hebr" typeface="Times New Roman"/>
@@ -5052,32 +5157,14 @@
         <a:font script="Mong" typeface="Mongolian Baiti"/>
         <a:font script="Viet" typeface="Times New Roman"/>
         <a:font script="Uigh" typeface="Microsoft Uighur"/>
-        <a:font script="Geor" typeface="Sylfaen"/>
-        <a:font script="Armn" typeface="Arial"/>
-        <a:font script="Bugi" typeface="Leelawadee UI"/>
-        <a:font script="Bopo" typeface="Microsoft JhengHei"/>
-        <a:font script="Java" typeface="Javanese Text"/>
-        <a:font script="Lisu" typeface="Segoe UI"/>
-        <a:font script="Mymr" typeface="Myanmar Text"/>
-        <a:font script="Nkoo" typeface="Ebrima"/>
-        <a:font script="Olck" typeface="Nirmala UI"/>
-        <a:font script="Osma" typeface="Ebrima"/>
-        <a:font script="Phag" typeface="Phagspa"/>
-        <a:font script="Syrn" typeface="Estrangelo Edessa"/>
-        <a:font script="Syrj" typeface="Estrangelo Edessa"/>
-        <a:font script="Syre" typeface="Estrangelo Edessa"/>
-        <a:font script="Sora" typeface="Nirmala UI"/>
-        <a:font script="Tale" typeface="Microsoft Tai Le"/>
-        <a:font script="Talu" typeface="Microsoft New Tai Lue"/>
-        <a:font script="Tfng" typeface="Ebrima"/>
       </a:majorFont>
       <a:minorFont>
-        <a:latin typeface="Aptos" panose="02110004020202020204"/>
+        <a:latin typeface="Cambria"/>
         <a:ea typeface=""/>
         <a:cs typeface=""/>
-        <a:font script="Jpan" typeface="游明朝"/>
+        <a:font script="Jpan" typeface="ＭＳ 明朝"/>
         <a:font script="Hang" typeface="맑은 고딕"/>
-        <a:font script="Hans" typeface="等线"/>
+        <a:font script="Hans" typeface="宋体"/>
         <a:font script="Hant" typeface="新細明體"/>
         <a:font script="Arab" typeface="Arial"/>
         <a:font script="Hebr" typeface="Arial"/>
@@ -5104,24 +5191,6 @@
         <a:font script="Mong" typeface="Mongolian Baiti"/>
         <a:font script="Viet" typeface="Arial"/>
         <a:font script="Uigh" typeface="Microsoft Uighur"/>
-        <a:font script="Geor" typeface="Sylfaen"/>
-        <a:font script="Armn" typeface="Arial"/>
-        <a:font script="Bugi" typeface="Leelawadee UI"/>
-        <a:font script="Bopo" typeface="Microsoft JhengHei"/>
-        <a:font script="Java" typeface="Javanese Text"/>
-        <a:font script="Lisu" typeface="Segoe UI"/>
-        <a:font script="Mymr" typeface="Myanmar Text"/>
-        <a:font script="Nkoo" typeface="Ebrima"/>
-        <a:font script="Olck" typeface="Nirmala UI"/>
-        <a:font script="Osma" typeface="Ebrima"/>
-        <a:font script="Phag" typeface="Phagspa"/>
-        <a:font script="Syrn" typeface="Estrangelo Edessa"/>
-        <a:font script="Syrj" typeface="Estrangelo Edessa"/>
-        <a:font script="Syre" typeface="Estrangelo Edessa"/>
-        <a:font script="Sora" typeface="Nirmala UI"/>
-        <a:font script="Tale" typeface="Microsoft Tai Le"/>
-        <a:font script="Talu" typeface="Microsoft New Tai Lue"/>
-        <a:font script="Tfng" typeface="Ebrima"/>
       </a:minorFont>
     </a:fontScheme>
     <a:fmtScheme name="Office">
@@ -5133,141 +5202,200 @@
           <a:gsLst>
             <a:gs pos="0">
               <a:schemeClr val="phClr">
-                <a:lumMod val="110000"/>
-                <a:satMod val="105000"/>
-                <a:tint val="67000"/>
+                <a:tint val="50000"/>
+                <a:satMod val="300000"/>
               </a:schemeClr>
             </a:gs>
-            <a:gs pos="50000">
+            <a:gs pos="35000">
               <a:schemeClr val="phClr">
-                <a:lumMod val="105000"/>
-                <a:satMod val="103000"/>
-                <a:tint val="73000"/>
+                <a:tint val="37000"/>
+                <a:satMod val="300000"/>
               </a:schemeClr>
             </a:gs>
             <a:gs pos="100000">
               <a:schemeClr val="phClr">
-                <a:lumMod val="105000"/>
-                <a:satMod val="109000"/>
-                <a:tint val="81000"/>
+                <a:tint val="15000"/>
+                <a:satMod val="350000"/>
               </a:schemeClr>
             </a:gs>
           </a:gsLst>
-          <a:lin ang="5400000" scaled="0"/>
+          <a:lin ang="16200000" scaled="1"/>
         </a:gradFill>
         <a:gradFill rotWithShape="1">
           <a:gsLst>
             <a:gs pos="0">
               <a:schemeClr val="phClr">
-                <a:satMod val="103000"/>
-                <a:lumMod val="102000"/>
-                <a:tint val="94000"/>
-              </a:schemeClr>
-            </a:gs>
-            <a:gs pos="50000">
-              <a:schemeClr val="phClr">
-                <a:satMod val="110000"/>
-                <a:lumMod val="100000"/>
+                <a:tint val="100000"/>
                 <a:shade val="100000"/>
+                <a:satMod val="130000"/>
               </a:schemeClr>
             </a:gs>
             <a:gs pos="100000">
               <a:schemeClr val="phClr">
-                <a:lumMod val="99000"/>
-                <a:satMod val="120000"/>
-                <a:shade val="78000"/>
+                <a:tint val="50000"/>
+                <a:shade val="100000"/>
+                <a:satMod val="350000"/>
               </a:schemeClr>
             </a:gs>
           </a:gsLst>
-          <a:lin ang="5400000" scaled="0"/>
+          <a:lin ang="16200000" scaled="0"/>
         </a:gradFill>
       </a:fillStyleLst>
       <a:lnStyleLst>
-        <a:ln w="6350" cap="flat" cmpd="sng" algn="ctr">
+        <a:ln w="9525" cap="flat" cmpd="sng" algn="ctr">
+          <a:solidFill>
+            <a:schemeClr val="phClr">
+              <a:shade val="95000"/>
+              <a:satMod val="105000"/>
+            </a:schemeClr>
+          </a:solidFill>
+          <a:prstDash val="solid"/>
+        </a:ln>
+        <a:ln w="25400" cap="flat" cmpd="sng" algn="ctr">
           <a:solidFill>
             <a:schemeClr val="phClr"/>
           </a:solidFill>
           <a:prstDash val="solid"/>
-          <a:miter lim="800000"/>
         </a:ln>
-        <a:ln w="12700" cap="flat" cmpd="sng" algn="ctr">
+        <a:ln w="38100" cap="flat" cmpd="sng" algn="ctr">
           <a:solidFill>
             <a:schemeClr val="phClr"/>
           </a:solidFill>
           <a:prstDash val="solid"/>
-          <a:miter lim="800000"/>
-        </a:ln>
-        <a:ln w="19050" cap="flat" cmpd="sng" algn="ctr">
-          <a:solidFill>
-            <a:schemeClr val="phClr"/>
-          </a:solidFill>
-          <a:prstDash val="solid"/>
-          <a:miter lim="800000"/>
         </a:ln>
       </a:lnStyleLst>
       <a:effectStyleLst>
         <a:effectStyle>
-          <a:effectLst/>
-        </a:effectStyle>
-        <a:effectStyle>
-          <a:effectLst/>
+          <a:effectLst>
+            <a:outerShdw blurRad="40000" dist="20000" dir="5400000" rotWithShape="0">
+              <a:srgbClr val="000000">
+                <a:alpha val="38000"/>
+              </a:srgbClr>
+            </a:outerShdw>
+          </a:effectLst>
         </a:effectStyle>
         <a:effectStyle>
           <a:effectLst>
-            <a:outerShdw blurRad="57150" dist="19050" dir="5400000" algn="ctr" rotWithShape="0">
+            <a:outerShdw blurRad="40000" dist="23000" dir="5400000" rotWithShape="0">
               <a:srgbClr val="000000">
-                <a:alpha val="63000"/>
+                <a:alpha val="35000"/>
               </a:srgbClr>
             </a:outerShdw>
           </a:effectLst>
+        </a:effectStyle>
+        <a:effectStyle>
+          <a:effectLst>
+            <a:outerShdw blurRad="40000" dist="23000" dir="5400000" rotWithShape="0">
+              <a:srgbClr val="000000">
+                <a:alpha val="35000"/>
+              </a:srgbClr>
+            </a:outerShdw>
+          </a:effectLst>
+          <a:scene3d>
+            <a:camera prst="orthographicFront">
+              <a:rot lat="0" lon="0" rev="0"/>
+            </a:camera>
+            <a:lightRig rig="threePt" dir="t">
+              <a:rot lat="0" lon="0" rev="1200000"/>
+            </a:lightRig>
+          </a:scene3d>
+          <a:sp3d>
+            <a:bevelT w="63500" h="25400"/>
+          </a:sp3d>
         </a:effectStyle>
       </a:effectStyleLst>
       <a:bgFillStyleLst>
         <a:solidFill>
           <a:schemeClr val="phClr"/>
         </a:solidFill>
-        <a:solidFill>
-          <a:schemeClr val="phClr">
-            <a:tint val="95000"/>
-            <a:satMod val="170000"/>
-          </a:schemeClr>
-        </a:solidFill>
         <a:gradFill rotWithShape="1">
           <a:gsLst>
             <a:gs pos="0">
               <a:schemeClr val="phClr">
-                <a:tint val="93000"/>
-                <a:satMod val="150000"/>
-                <a:shade val="98000"/>
-                <a:lumMod val="102000"/>
+                <a:tint val="40000"/>
+                <a:satMod val="350000"/>
               </a:schemeClr>
             </a:gs>
-            <a:gs pos="50000">
+            <a:gs pos="40000">
               <a:schemeClr val="phClr">
-                <a:tint val="98000"/>
-                <a:satMod val="130000"/>
-                <a:shade val="90000"/>
-                <a:lumMod val="103000"/>
+                <a:tint val="45000"/>
+                <a:shade val="99000"/>
+                <a:satMod val="350000"/>
               </a:schemeClr>
             </a:gs>
             <a:gs pos="100000">
               <a:schemeClr val="phClr">
-                <a:shade val="63000"/>
-                <a:satMod val="120000"/>
+                <a:shade val="20000"/>
+                <a:satMod val="255000"/>
               </a:schemeClr>
             </a:gs>
           </a:gsLst>
-          <a:lin ang="5400000" scaled="0"/>
+          <a:path path="circle">
+            <a:fillToRect l="50000" t="-80000" r="50000" b="180000"/>
+          </a:path>
+        </a:gradFill>
+        <a:gradFill rotWithShape="1">
+          <a:gsLst>
+            <a:gs pos="0">
+              <a:schemeClr val="phClr">
+                <a:tint val="80000"/>
+                <a:satMod val="300000"/>
+              </a:schemeClr>
+            </a:gs>
+            <a:gs pos="100000">
+              <a:schemeClr val="phClr">
+                <a:shade val="30000"/>
+                <a:satMod val="200000"/>
+              </a:schemeClr>
+            </a:gs>
+          </a:gsLst>
+          <a:path path="circle">
+            <a:fillToRect l="50000" t="50000" r="50000" b="50000"/>
+          </a:path>
         </a:gradFill>
       </a:bgFillStyleLst>
     </a:fmtScheme>
   </a:themeElements>
-  <a:objectDefaults/>
+  <a:objectDefaults>
+    <a:spDef>
+      <a:spPr/>
+      <a:bodyPr/>
+      <a:lstStyle/>
+      <a:style>
+        <a:lnRef idx="1">
+          <a:schemeClr val="accent1"/>
+        </a:lnRef>
+        <a:fillRef idx="3">
+          <a:schemeClr val="accent1"/>
+        </a:fillRef>
+        <a:effectRef idx="2">
+          <a:schemeClr val="accent1"/>
+        </a:effectRef>
+        <a:fontRef idx="minor">
+          <a:schemeClr val="lt1"/>
+        </a:fontRef>
+      </a:style>
+    </a:spDef>
+    <a:lnDef>
+      <a:spPr/>
+      <a:bodyPr/>
+      <a:lstStyle/>
+      <a:style>
+        <a:lnRef idx="2">
+          <a:schemeClr val="accent1"/>
+        </a:lnRef>
+        <a:fillRef idx="0">
+          <a:schemeClr val="accent1"/>
+        </a:fillRef>
+        <a:effectRef idx="1">
+          <a:schemeClr val="accent1"/>
+        </a:effectRef>
+        <a:fontRef idx="minor">
+          <a:schemeClr val="tx1"/>
+        </a:fontRef>
+      </a:style>
+    </a:lnDef>
+  </a:objectDefaults>
   <a:extraClrSchemeLst/>
-  <a:extLst>
-    <a:ext uri="{05A4C25C-085E-4340-85A3-A5531E510DB2}">
-      <thm15:themeFamily xmlns:thm15="http://schemas.microsoft.com/office/thememl/2012/main" name="Office Theme" id="{2E142A2C-CD16-42D6-873A-C26D2A0506FA}" vid="{1BDDFF52-6CD6-40A5-AB3C-68EB2F1E4D0A}"/>
-    </a:ext>
-  </a:extLst>
 </a:theme>
 </file>
</xml_diff>